<commit_message>
Wyrownawcze: 3 arkusze na poziom wyzej i wersja PDF 2xA5 na jednej A4
Arkusze 5-7 (Drugie miejsce, Dwie drogi do Afryki, Ktos nowy w domu):
odpowiedzi trzeba wywnioskowac, P/F/? z opcja 'tekst o tym nie mowi',
klucz rozszerzony. Kazdy arkusz ma tez PDF z obiema stronami jako A5
obok siebie na jednej stronie A4 (HTML -> Chrome -> pymupdf, bo Word
bez licencji nie eksportuje PDF).

Co-Authored-By: Claude Opus 5.5 <noreply@anthropic.com>
</commit_message>
<xml_diff>
--- a/public/materialy/wyrownawcze/klucz-odpowiedzi-arkusze-wyrownawcze.docx
+++ b/public/materialy/wyrownawcze/klucz-odpowiedzi-arkusze-wyrownawcze.docx
@@ -4244,6 +4244,3168 @@
         <w:t>Poproś uczniów, aby wskazali fragment tekstu potwierdzający odpowiedź, poprawili jedno zadanie i nazwali strategię, która im pomogła.</w:t>
       </w:r>
     </w:p>
+    <w:p>
+      <w:r>
+        <w:br w:type="page"/>
+      </w:r>
+    </w:p>
+    <w:p>
+      <w:pPr>
+        <w:pStyle w:val="Heading1"/>
+      </w:pPr>
+      <w:r>
+        <w:rPr>
+          <w:rFonts w:ascii="Aptos" w:hAnsi="Aptos" w:eastAsia="Aptos"/>
+          <w:b/>
+          <w:i w:val="0"/>
+          <w:color w:val="000000"/>
+          <w:sz w:val="26"/>
+        </w:rPr>
+        <w:t>Arkusz 5  Drugie miejsce</w:t>
+      </w:r>
+    </w:p>
+    <w:tbl>
+      <w:tblPr>
+        <w:tblW w:type="auto" w:w="0"/>
+        <w:jc w:val="center"/>
+        <w:tblLayout w:type="fixed"/>
+        <w:tblLook w:firstColumn="1" w:firstRow="1" w:lastColumn="0" w:lastRow="0" w:noHBand="0" w:noVBand="1" w:val="04A0"/>
+      </w:tblPr>
+      <w:tblGrid>
+        <w:gridCol w:w="964"/>
+        <w:gridCol w:w="8731"/>
+      </w:tblGrid>
+      <w:tr>
+        <w:trPr>
+          <w:tblHeader w:val="true"/>
+        </w:trPr>
+        <w:tc>
+          <w:tcPr>
+            <w:tcW w:type="dxa" w:w="964"/>
+            <w:shd w:fill="1F4E78"/>
+            <w:tcBorders>
+              <w:top w:val="single" w:sz="7" w:space="0" w:color="D9D9D9"/>
+              <w:left w:val="single" w:sz="7" w:space="0" w:color="D9D9D9"/>
+              <w:bottom w:val="single" w:sz="7" w:space="0" w:color="D9D9D9"/>
+              <w:right w:val="single" w:sz="7" w:space="0" w:color="D9D9D9"/>
+              <w:insideH w:val="single" w:sz="7" w:space="0" w:color="D9D9D9"/>
+              <w:insideV w:val="single" w:sz="7" w:space="0" w:color="D9D9D9"/>
+            </w:tcBorders>
+            <w:tcMar>
+              <w:top w:w="105" w:type="dxa"/>
+              <w:start w:w="110" w:type="dxa"/>
+              <w:bottom w:w="105" w:type="dxa"/>
+              <w:end w:w="110" w:type="dxa"/>
+            </w:tcMar>
+          </w:tcPr>
+          <w:p>
+            <w:pPr>
+              <w:keepNext w:val="0"/>
+              <w:spacing w:before="0" w:after="0" w:line="252" w:lineRule="auto"/>
+              <w:jc w:val="center"/>
+            </w:pPr>
+            <w:r>
+              <w:rPr>
+                <w:rFonts w:ascii="Aptos" w:hAnsi="Aptos" w:eastAsia="Aptos"/>
+                <w:b/>
+                <w:i w:val="0"/>
+                <w:color w:val="FFFFFF"/>
+                <w:sz w:val="19"/>
+              </w:rPr>
+              <w:t>Zadanie</w:t>
+            </w:r>
+          </w:p>
+        </w:tc>
+        <w:tc>
+          <w:tcPr>
+            <w:tcW w:type="dxa" w:w="8731"/>
+            <w:shd w:fill="1F4E78"/>
+            <w:tcBorders>
+              <w:top w:val="single" w:sz="7" w:space="0" w:color="D9D9D9"/>
+              <w:left w:val="single" w:sz="7" w:space="0" w:color="D9D9D9"/>
+              <w:bottom w:val="single" w:sz="7" w:space="0" w:color="D9D9D9"/>
+              <w:right w:val="single" w:sz="7" w:space="0" w:color="D9D9D9"/>
+              <w:insideH w:val="single" w:sz="7" w:space="0" w:color="D9D9D9"/>
+              <w:insideV w:val="single" w:sz="7" w:space="0" w:color="D9D9D9"/>
+            </w:tcBorders>
+            <w:tcMar>
+              <w:top w:w="105" w:type="dxa"/>
+              <w:start w:w="110" w:type="dxa"/>
+              <w:bottom w:w="105" w:type="dxa"/>
+              <w:end w:w="110" w:type="dxa"/>
+            </w:tcMar>
+          </w:tcPr>
+          <w:p>
+            <w:pPr>
+              <w:keepNext w:val="0"/>
+              <w:spacing w:before="0" w:after="0" w:line="252" w:lineRule="auto"/>
+              <w:jc w:val="center"/>
+            </w:pPr>
+            <w:r>
+              <w:rPr>
+                <w:rFonts w:ascii="Aptos" w:hAnsi="Aptos" w:eastAsia="Aptos"/>
+                <w:b/>
+                <w:i w:val="0"/>
+                <w:color w:val="FFFFFF"/>
+                <w:sz w:val="19"/>
+              </w:rPr>
+              <w:t>Odpowiedź lub kryterium</w:t>
+            </w:r>
+          </w:p>
+        </w:tc>
+      </w:tr>
+      <w:tr>
+        <w:tc>
+          <w:tcPr>
+            <w:tcW w:type="dxa" w:w="964"/>
+            <w:tcBorders>
+              <w:top w:val="single" w:sz="7" w:space="0" w:color="D9D9D9"/>
+              <w:left w:val="single" w:sz="7" w:space="0" w:color="D9D9D9"/>
+              <w:bottom w:val="single" w:sz="7" w:space="0" w:color="D9D9D9"/>
+              <w:right w:val="single" w:sz="7" w:space="0" w:color="D9D9D9"/>
+              <w:insideH w:val="single" w:sz="7" w:space="0" w:color="D9D9D9"/>
+              <w:insideV w:val="single" w:sz="7" w:space="0" w:color="D9D9D9"/>
+            </w:tcBorders>
+            <w:tcMar>
+              <w:top w:w="90" w:type="dxa"/>
+              <w:start w:w="110" w:type="dxa"/>
+              <w:bottom w:w="90" w:type="dxa"/>
+              <w:end w:w="110" w:type="dxa"/>
+            </w:tcMar>
+            <w:vAlign w:val="center"/>
+          </w:tcPr>
+          <w:p>
+            <w:pPr>
+              <w:keepNext w:val="0"/>
+              <w:spacing w:before="0" w:after="0" w:line="252" w:lineRule="auto"/>
+              <w:jc w:val="center"/>
+            </w:pPr>
+            <w:r>
+              <w:rPr>
+                <w:rFonts w:ascii="Aptos" w:hAnsi="Aptos" w:eastAsia="Aptos"/>
+                <w:b/>
+                <w:i w:val="0"/>
+                <w:color w:val="1F4E78"/>
+                <w:sz w:val="18"/>
+              </w:rPr>
+              <w:t>1</w:t>
+            </w:r>
+          </w:p>
+        </w:tc>
+        <w:tc>
+          <w:tcPr>
+            <w:tcW w:type="dxa" w:w="8731"/>
+            <w:tcBorders>
+              <w:top w:val="single" w:sz="7" w:space="0" w:color="D9D9D9"/>
+              <w:left w:val="single" w:sz="7" w:space="0" w:color="D9D9D9"/>
+              <w:bottom w:val="single" w:sz="7" w:space="0" w:color="D9D9D9"/>
+              <w:right w:val="single" w:sz="7" w:space="0" w:color="D9D9D9"/>
+              <w:insideH w:val="single" w:sz="7" w:space="0" w:color="D9D9D9"/>
+              <w:insideV w:val="single" w:sz="7" w:space="0" w:color="D9D9D9"/>
+            </w:tcBorders>
+            <w:tcMar>
+              <w:top w:w="90" w:type="dxa"/>
+              <w:start w:w="110" w:type="dxa"/>
+              <w:bottom w:w="90" w:type="dxa"/>
+              <w:end w:w="110" w:type="dxa"/>
+            </w:tcMar>
+            <w:vAlign w:val="center"/>
+          </w:tcPr>
+          <w:p>
+            <w:pPr>
+              <w:keepNext w:val="0"/>
+              <w:spacing w:before="0" w:after="0" w:line="240" w:lineRule="auto"/>
+            </w:pPr>
+            <w:r>
+              <w:rPr>
+                <w:rFonts w:ascii="Aptos" w:hAnsi="Aptos" w:eastAsia="Aptos"/>
+                <w:b w:val="0"/>
+                <w:i w:val="0"/>
+                <w:color w:val="1F2937"/>
+                <w:sz w:val="18"/>
+              </w:rPr>
+              <w:t>Pierwsze miejsce zajęła Iga, drugie Antek.</w:t>
+            </w:r>
+          </w:p>
+        </w:tc>
+      </w:tr>
+      <w:tr>
+        <w:tc>
+          <w:tcPr>
+            <w:tcW w:type="dxa" w:w="964"/>
+            <w:tcBorders>
+              <w:top w:val="single" w:sz="7" w:space="0" w:color="D9D9D9"/>
+              <w:left w:val="single" w:sz="7" w:space="0" w:color="D9D9D9"/>
+              <w:bottom w:val="single" w:sz="7" w:space="0" w:color="D9D9D9"/>
+              <w:right w:val="single" w:sz="7" w:space="0" w:color="D9D9D9"/>
+              <w:insideH w:val="single" w:sz="7" w:space="0" w:color="D9D9D9"/>
+              <w:insideV w:val="single" w:sz="7" w:space="0" w:color="D9D9D9"/>
+            </w:tcBorders>
+            <w:tcMar>
+              <w:top w:w="90" w:type="dxa"/>
+              <w:start w:w="110" w:type="dxa"/>
+              <w:bottom w:w="90" w:type="dxa"/>
+              <w:end w:w="110" w:type="dxa"/>
+            </w:tcMar>
+            <w:vAlign w:val="center"/>
+            <w:shd w:fill="F8FAFC"/>
+          </w:tcPr>
+          <w:p>
+            <w:pPr>
+              <w:keepNext w:val="0"/>
+              <w:spacing w:before="0" w:after="0" w:line="252" w:lineRule="auto"/>
+              <w:jc w:val="center"/>
+            </w:pPr>
+            <w:r>
+              <w:rPr>
+                <w:rFonts w:ascii="Aptos" w:hAnsi="Aptos" w:eastAsia="Aptos"/>
+                <w:b/>
+                <w:i w:val="0"/>
+                <w:color w:val="1F4E78"/>
+                <w:sz w:val="18"/>
+              </w:rPr>
+              <w:t>2</w:t>
+            </w:r>
+          </w:p>
+        </w:tc>
+        <w:tc>
+          <w:tcPr>
+            <w:tcW w:type="dxa" w:w="8731"/>
+            <w:tcBorders>
+              <w:top w:val="single" w:sz="7" w:space="0" w:color="D9D9D9"/>
+              <w:left w:val="single" w:sz="7" w:space="0" w:color="D9D9D9"/>
+              <w:bottom w:val="single" w:sz="7" w:space="0" w:color="D9D9D9"/>
+              <w:right w:val="single" w:sz="7" w:space="0" w:color="D9D9D9"/>
+              <w:insideH w:val="single" w:sz="7" w:space="0" w:color="D9D9D9"/>
+              <w:insideV w:val="single" w:sz="7" w:space="0" w:color="D9D9D9"/>
+            </w:tcBorders>
+            <w:tcMar>
+              <w:top w:w="90" w:type="dxa"/>
+              <w:start w:w="110" w:type="dxa"/>
+              <w:bottom w:w="90" w:type="dxa"/>
+              <w:end w:w="110" w:type="dxa"/>
+            </w:tcMar>
+            <w:vAlign w:val="center"/>
+            <w:shd w:fill="F8FAFC"/>
+          </w:tcPr>
+          <w:p>
+            <w:pPr>
+              <w:keepNext w:val="0"/>
+              <w:spacing w:before="0" w:after="0" w:line="240" w:lineRule="auto"/>
+            </w:pPr>
+            <w:r>
+              <w:rPr>
+                <w:rFonts w:ascii="Aptos" w:hAnsi="Aptos" w:eastAsia="Aptos"/>
+                <w:b w:val="0"/>
+                <w:i w:val="0"/>
+                <w:color w:val="1F2937"/>
+                <w:sz w:val="18"/>
+              </w:rPr>
+              <w:t>Był rozczarowany, smutny, myślami przy konkursie - nie słuchał lekcji, tylko bezmyślnie rysował.</w:t>
+            </w:r>
+          </w:p>
+        </w:tc>
+      </w:tr>
+      <w:tr>
+        <w:tc>
+          <w:tcPr>
+            <w:tcW w:type="dxa" w:w="964"/>
+            <w:tcBorders>
+              <w:top w:val="single" w:sz="7" w:space="0" w:color="D9D9D9"/>
+              <w:left w:val="single" w:sz="7" w:space="0" w:color="D9D9D9"/>
+              <w:bottom w:val="single" w:sz="7" w:space="0" w:color="D9D9D9"/>
+              <w:right w:val="single" w:sz="7" w:space="0" w:color="D9D9D9"/>
+              <w:insideH w:val="single" w:sz="7" w:space="0" w:color="D9D9D9"/>
+              <w:insideV w:val="single" w:sz="7" w:space="0" w:color="D9D9D9"/>
+            </w:tcBorders>
+            <w:tcMar>
+              <w:top w:w="90" w:type="dxa"/>
+              <w:start w:w="110" w:type="dxa"/>
+              <w:bottom w:w="90" w:type="dxa"/>
+              <w:end w:w="110" w:type="dxa"/>
+            </w:tcMar>
+            <w:vAlign w:val="center"/>
+          </w:tcPr>
+          <w:p>
+            <w:pPr>
+              <w:keepNext w:val="0"/>
+              <w:spacing w:before="0" w:after="0" w:line="252" w:lineRule="auto"/>
+              <w:jc w:val="center"/>
+            </w:pPr>
+            <w:r>
+              <w:rPr>
+                <w:rFonts w:ascii="Aptos" w:hAnsi="Aptos" w:eastAsia="Aptos"/>
+                <w:b/>
+                <w:i w:val="0"/>
+                <w:color w:val="1F4E78"/>
+                <w:sz w:val="18"/>
+              </w:rPr>
+              <w:t>3</w:t>
+            </w:r>
+          </w:p>
+        </w:tc>
+        <w:tc>
+          <w:tcPr>
+            <w:tcW w:type="dxa" w:w="8731"/>
+            <w:tcBorders>
+              <w:top w:val="single" w:sz="7" w:space="0" w:color="D9D9D9"/>
+              <w:left w:val="single" w:sz="7" w:space="0" w:color="D9D9D9"/>
+              <w:bottom w:val="single" w:sz="7" w:space="0" w:color="D9D9D9"/>
+              <w:right w:val="single" w:sz="7" w:space="0" w:color="D9D9D9"/>
+              <w:insideH w:val="single" w:sz="7" w:space="0" w:color="D9D9D9"/>
+              <w:insideV w:val="single" w:sz="7" w:space="0" w:color="D9D9D9"/>
+            </w:tcBorders>
+            <w:tcMar>
+              <w:top w:w="90" w:type="dxa"/>
+              <w:start w:w="110" w:type="dxa"/>
+              <w:bottom w:w="90" w:type="dxa"/>
+              <w:end w:w="110" w:type="dxa"/>
+            </w:tcMar>
+            <w:vAlign w:val="center"/>
+          </w:tcPr>
+          <w:p>
+            <w:pPr>
+              <w:keepNext w:val="0"/>
+              <w:spacing w:before="0" w:after="0" w:line="240" w:lineRule="auto"/>
+            </w:pPr>
+            <w:r>
+              <w:rPr>
+                <w:rFonts w:ascii="Aptos" w:hAnsi="Aptos" w:eastAsia="Aptos"/>
+                <w:b w:val="0"/>
+                <w:i w:val="0"/>
+                <w:color w:val="1F2937"/>
+                <w:sz w:val="18"/>
+              </w:rPr>
+              <w:t>Chciała pokazać, że jej też nie wszystko wychodzi od razu.</w:t>
+            </w:r>
+          </w:p>
+        </w:tc>
+      </w:tr>
+      <w:tr>
+        <w:tc>
+          <w:tcPr>
+            <w:tcW w:type="dxa" w:w="964"/>
+            <w:tcBorders>
+              <w:top w:val="single" w:sz="7" w:space="0" w:color="D9D9D9"/>
+              <w:left w:val="single" w:sz="7" w:space="0" w:color="D9D9D9"/>
+              <w:bottom w:val="single" w:sz="7" w:space="0" w:color="D9D9D9"/>
+              <w:right w:val="single" w:sz="7" w:space="0" w:color="D9D9D9"/>
+              <w:insideH w:val="single" w:sz="7" w:space="0" w:color="D9D9D9"/>
+              <w:insideV w:val="single" w:sz="7" w:space="0" w:color="D9D9D9"/>
+            </w:tcBorders>
+            <w:tcMar>
+              <w:top w:w="90" w:type="dxa"/>
+              <w:start w:w="110" w:type="dxa"/>
+              <w:bottom w:w="90" w:type="dxa"/>
+              <w:end w:w="110" w:type="dxa"/>
+            </w:tcMar>
+            <w:vAlign w:val="center"/>
+            <w:shd w:fill="F8FAFC"/>
+          </w:tcPr>
+          <w:p>
+            <w:pPr>
+              <w:keepNext w:val="0"/>
+              <w:spacing w:before="0" w:after="0" w:line="252" w:lineRule="auto"/>
+              <w:jc w:val="center"/>
+            </w:pPr>
+            <w:r>
+              <w:rPr>
+                <w:rFonts w:ascii="Aptos" w:hAnsi="Aptos" w:eastAsia="Aptos"/>
+                <w:b/>
+                <w:i w:val="0"/>
+                <w:color w:val="1F4E78"/>
+                <w:sz w:val="18"/>
+              </w:rPr>
+              <w:t>4</w:t>
+            </w:r>
+          </w:p>
+        </w:tc>
+        <w:tc>
+          <w:tcPr>
+            <w:tcW w:type="dxa" w:w="8731"/>
+            <w:tcBorders>
+              <w:top w:val="single" w:sz="7" w:space="0" w:color="D9D9D9"/>
+              <w:left w:val="single" w:sz="7" w:space="0" w:color="D9D9D9"/>
+              <w:bottom w:val="single" w:sz="7" w:space="0" w:color="D9D9D9"/>
+              <w:right w:val="single" w:sz="7" w:space="0" w:color="D9D9D9"/>
+              <w:insideH w:val="single" w:sz="7" w:space="0" w:color="D9D9D9"/>
+              <w:insideV w:val="single" w:sz="7" w:space="0" w:color="D9D9D9"/>
+            </w:tcBorders>
+            <w:tcMar>
+              <w:top w:w="90" w:type="dxa"/>
+              <w:start w:w="110" w:type="dxa"/>
+              <w:bottom w:w="90" w:type="dxa"/>
+              <w:end w:w="110" w:type="dxa"/>
+            </w:tcMar>
+            <w:vAlign w:val="center"/>
+            <w:shd w:fill="F8FAFC"/>
+          </w:tcPr>
+          <w:p>
+            <w:pPr>
+              <w:keepNext w:val="0"/>
+              <w:spacing w:before="0" w:after="0" w:line="240" w:lineRule="auto"/>
+            </w:pPr>
+            <w:r>
+              <w:rPr>
+                <w:rFonts w:ascii="Aptos" w:hAnsi="Aptos" w:eastAsia="Aptos"/>
+                <w:b w:val="0"/>
+                <w:i w:val="0"/>
+                <w:color w:val="1F2937"/>
+                <w:sz w:val="18"/>
+              </w:rPr>
+              <w:t>F (Iga jest z równoległej klasy), ?, P. Omówić różnicę między F a ?: fałsz to coś sprzecznego z tekstem, ? to coś, o czym tekst nie mówi.</w:t>
+            </w:r>
+          </w:p>
+        </w:tc>
+      </w:tr>
+      <w:tr>
+        <w:tc>
+          <w:tcPr>
+            <w:tcW w:type="dxa" w:w="964"/>
+            <w:tcBorders>
+              <w:top w:val="single" w:sz="7" w:space="0" w:color="D9D9D9"/>
+              <w:left w:val="single" w:sz="7" w:space="0" w:color="D9D9D9"/>
+              <w:bottom w:val="single" w:sz="7" w:space="0" w:color="D9D9D9"/>
+              <w:right w:val="single" w:sz="7" w:space="0" w:color="D9D9D9"/>
+              <w:insideH w:val="single" w:sz="7" w:space="0" w:color="D9D9D9"/>
+              <w:insideV w:val="single" w:sz="7" w:space="0" w:color="D9D9D9"/>
+            </w:tcBorders>
+            <w:tcMar>
+              <w:top w:w="90" w:type="dxa"/>
+              <w:start w:w="110" w:type="dxa"/>
+              <w:bottom w:w="90" w:type="dxa"/>
+              <w:end w:w="110" w:type="dxa"/>
+            </w:tcMar>
+            <w:vAlign w:val="center"/>
+          </w:tcPr>
+          <w:p>
+            <w:pPr>
+              <w:keepNext w:val="0"/>
+              <w:spacing w:before="0" w:after="0" w:line="252" w:lineRule="auto"/>
+              <w:jc w:val="center"/>
+            </w:pPr>
+            <w:r>
+              <w:rPr>
+                <w:rFonts w:ascii="Aptos" w:hAnsi="Aptos" w:eastAsia="Aptos"/>
+                <w:b/>
+                <w:i w:val="0"/>
+                <w:color w:val="1F4E78"/>
+                <w:sz w:val="18"/>
+              </w:rPr>
+              <w:t>5</w:t>
+            </w:r>
+          </w:p>
+        </w:tc>
+        <w:tc>
+          <w:tcPr>
+            <w:tcW w:type="dxa" w:w="8731"/>
+            <w:tcBorders>
+              <w:top w:val="single" w:sz="7" w:space="0" w:color="D9D9D9"/>
+              <w:left w:val="single" w:sz="7" w:space="0" w:color="D9D9D9"/>
+              <w:bottom w:val="single" w:sz="7" w:space="0" w:color="D9D9D9"/>
+              <w:right w:val="single" w:sz="7" w:space="0" w:color="D9D9D9"/>
+              <w:insideH w:val="single" w:sz="7" w:space="0" w:color="D9D9D9"/>
+              <w:insideV w:val="single" w:sz="7" w:space="0" w:color="D9D9D9"/>
+            </w:tcBorders>
+            <w:tcMar>
+              <w:top w:w="90" w:type="dxa"/>
+              <w:start w:w="110" w:type="dxa"/>
+              <w:bottom w:w="90" w:type="dxa"/>
+              <w:end w:w="110" w:type="dxa"/>
+            </w:tcMar>
+            <w:vAlign w:val="center"/>
+          </w:tcPr>
+          <w:p>
+            <w:pPr>
+              <w:keepNext w:val="0"/>
+              <w:spacing w:before="0" w:after="0" w:line="240" w:lineRule="auto"/>
+            </w:pPr>
+            <w:r>
+              <w:rPr>
+                <w:rFonts w:ascii="Aptos" w:hAnsi="Aptos" w:eastAsia="Aptos"/>
+                <w:b w:val="0"/>
+                <w:i w:val="0"/>
+                <w:color w:val="1F2937"/>
+                <w:sz w:val="18"/>
+              </w:rPr>
+              <w:t>Na przykład: narysowałeś kota tak, że widać, jak się porusza / rysunek wygląda jak prawdziwy lot. Kot nie leci naprawdę - to pochwała rysunku.</w:t>
+            </w:r>
+          </w:p>
+        </w:tc>
+      </w:tr>
+      <w:tr>
+        <w:tc>
+          <w:tcPr>
+            <w:tcW w:type="dxa" w:w="964"/>
+            <w:tcBorders>
+              <w:top w:val="single" w:sz="7" w:space="0" w:color="D9D9D9"/>
+              <w:left w:val="single" w:sz="7" w:space="0" w:color="D9D9D9"/>
+              <w:bottom w:val="single" w:sz="7" w:space="0" w:color="D9D9D9"/>
+              <w:right w:val="single" w:sz="7" w:space="0" w:color="D9D9D9"/>
+              <w:insideH w:val="single" w:sz="7" w:space="0" w:color="D9D9D9"/>
+              <w:insideV w:val="single" w:sz="7" w:space="0" w:color="D9D9D9"/>
+            </w:tcBorders>
+            <w:tcMar>
+              <w:top w:w="90" w:type="dxa"/>
+              <w:start w:w="110" w:type="dxa"/>
+              <w:bottom w:w="90" w:type="dxa"/>
+              <w:end w:w="110" w:type="dxa"/>
+            </w:tcMar>
+            <w:vAlign w:val="center"/>
+            <w:shd w:fill="F8FAFC"/>
+          </w:tcPr>
+          <w:p>
+            <w:pPr>
+              <w:keepNext w:val="0"/>
+              <w:spacing w:before="0" w:after="0" w:line="252" w:lineRule="auto"/>
+              <w:jc w:val="center"/>
+            </w:pPr>
+            <w:r>
+              <w:rPr>
+                <w:rFonts w:ascii="Aptos" w:hAnsi="Aptos" w:eastAsia="Aptos"/>
+                <w:b/>
+                <w:i w:val="0"/>
+                <w:color w:val="1F4E78"/>
+                <w:sz w:val="18"/>
+              </w:rPr>
+              <w:t>6</w:t>
+            </w:r>
+          </w:p>
+        </w:tc>
+        <w:tc>
+          <w:tcPr>
+            <w:tcW w:type="dxa" w:w="8731"/>
+            <w:tcBorders>
+              <w:top w:val="single" w:sz="7" w:space="0" w:color="D9D9D9"/>
+              <w:left w:val="single" w:sz="7" w:space="0" w:color="D9D9D9"/>
+              <w:bottom w:val="single" w:sz="7" w:space="0" w:color="D9D9D9"/>
+              <w:right w:val="single" w:sz="7" w:space="0" w:color="D9D9D9"/>
+              <w:insideH w:val="single" w:sz="7" w:space="0" w:color="D9D9D9"/>
+              <w:insideV w:val="single" w:sz="7" w:space="0" w:color="D9D9D9"/>
+            </w:tcBorders>
+            <w:tcMar>
+              <w:top w:w="90" w:type="dxa"/>
+              <w:start w:w="110" w:type="dxa"/>
+              <w:bottom w:w="90" w:type="dxa"/>
+              <w:end w:w="110" w:type="dxa"/>
+            </w:tcMar>
+            <w:vAlign w:val="center"/>
+            <w:shd w:fill="F8FAFC"/>
+          </w:tcPr>
+          <w:p>
+            <w:pPr>
+              <w:keepNext w:val="0"/>
+              <w:spacing w:before="0" w:after="0" w:line="240" w:lineRule="auto"/>
+            </w:pPr>
+            <w:r>
+              <w:rPr>
+                <w:rFonts w:ascii="Aptos" w:hAnsi="Aptos" w:eastAsia="Aptos"/>
+                <w:b w:val="0"/>
+                <w:i w:val="0"/>
+                <w:color w:val="1F2937"/>
+                <w:sz w:val="18"/>
+              </w:rPr>
+              <w:t>Na początku rozczarowany i zazdrosny (rysuje kwadraty, mruczy, że jury wybrało jej pracę), na końcu pogodzony, chętny do współpracy (rysuje smoka z kotem i proponuje wspólny odcinek).</w:t>
+            </w:r>
+          </w:p>
+        </w:tc>
+      </w:tr>
+      <w:tr>
+        <w:tc>
+          <w:tcPr>
+            <w:tcW w:type="dxa" w:w="964"/>
+            <w:tcBorders>
+              <w:top w:val="single" w:sz="7" w:space="0" w:color="D9D9D9"/>
+              <w:left w:val="single" w:sz="7" w:space="0" w:color="D9D9D9"/>
+              <w:bottom w:val="single" w:sz="7" w:space="0" w:color="D9D9D9"/>
+              <w:right w:val="single" w:sz="7" w:space="0" w:color="D9D9D9"/>
+              <w:insideH w:val="single" w:sz="7" w:space="0" w:color="D9D9D9"/>
+              <w:insideV w:val="single" w:sz="7" w:space="0" w:color="D9D9D9"/>
+            </w:tcBorders>
+            <w:tcMar>
+              <w:top w:w="90" w:type="dxa"/>
+              <w:start w:w="110" w:type="dxa"/>
+              <w:bottom w:w="90" w:type="dxa"/>
+              <w:end w:w="110" w:type="dxa"/>
+            </w:tcMar>
+            <w:vAlign w:val="center"/>
+          </w:tcPr>
+          <w:p>
+            <w:pPr>
+              <w:keepNext w:val="0"/>
+              <w:spacing w:before="0" w:after="0" w:line="252" w:lineRule="auto"/>
+              <w:jc w:val="center"/>
+            </w:pPr>
+            <w:r>
+              <w:rPr>
+                <w:rFonts w:ascii="Aptos" w:hAnsi="Aptos" w:eastAsia="Aptos"/>
+                <w:b/>
+                <w:i w:val="0"/>
+                <w:color w:val="1F4E78"/>
+                <w:sz w:val="18"/>
+              </w:rPr>
+              <w:t>7</w:t>
+            </w:r>
+          </w:p>
+        </w:tc>
+        <w:tc>
+          <w:tcPr>
+            <w:tcW w:type="dxa" w:w="8731"/>
+            <w:tcBorders>
+              <w:top w:val="single" w:sz="7" w:space="0" w:color="D9D9D9"/>
+              <w:left w:val="single" w:sz="7" w:space="0" w:color="D9D9D9"/>
+              <w:bottom w:val="single" w:sz="7" w:space="0" w:color="D9D9D9"/>
+              <w:right w:val="single" w:sz="7" w:space="0" w:color="D9D9D9"/>
+              <w:insideH w:val="single" w:sz="7" w:space="0" w:color="D9D9D9"/>
+              <w:insideV w:val="single" w:sz="7" w:space="0" w:color="D9D9D9"/>
+            </w:tcBorders>
+            <w:tcMar>
+              <w:top w:w="90" w:type="dxa"/>
+              <w:start w:w="110" w:type="dxa"/>
+              <w:bottom w:w="90" w:type="dxa"/>
+              <w:end w:w="110" w:type="dxa"/>
+            </w:tcMar>
+            <w:vAlign w:val="center"/>
+          </w:tcPr>
+          <w:p>
+            <w:pPr>
+              <w:keepNext w:val="0"/>
+              <w:spacing w:before="0" w:after="0" w:line="240" w:lineRule="auto"/>
+            </w:pPr>
+            <w:r>
+              <w:rPr>
+                <w:rFonts w:ascii="Aptos" w:hAnsi="Aptos" w:eastAsia="Aptos"/>
+                <w:b w:val="0"/>
+                <w:i w:val="0"/>
+                <w:color w:val="1F2937"/>
+                <w:sz w:val="18"/>
+              </w:rPr>
+              <w:t>komiksu, komiksowi, komiksem, komiksie</w:t>
+            </w:r>
+          </w:p>
+        </w:tc>
+      </w:tr>
+      <w:tr>
+        <w:tc>
+          <w:tcPr>
+            <w:tcW w:type="dxa" w:w="964"/>
+            <w:tcBorders>
+              <w:top w:val="single" w:sz="7" w:space="0" w:color="D9D9D9"/>
+              <w:left w:val="single" w:sz="7" w:space="0" w:color="D9D9D9"/>
+              <w:bottom w:val="single" w:sz="7" w:space="0" w:color="D9D9D9"/>
+              <w:right w:val="single" w:sz="7" w:space="0" w:color="D9D9D9"/>
+              <w:insideH w:val="single" w:sz="7" w:space="0" w:color="D9D9D9"/>
+              <w:insideV w:val="single" w:sz="7" w:space="0" w:color="D9D9D9"/>
+            </w:tcBorders>
+            <w:tcMar>
+              <w:top w:w="90" w:type="dxa"/>
+              <w:start w:w="110" w:type="dxa"/>
+              <w:bottom w:w="90" w:type="dxa"/>
+              <w:end w:w="110" w:type="dxa"/>
+            </w:tcMar>
+            <w:vAlign w:val="center"/>
+            <w:shd w:fill="F8FAFC"/>
+          </w:tcPr>
+          <w:p>
+            <w:pPr>
+              <w:keepNext w:val="0"/>
+              <w:spacing w:before="0" w:after="0" w:line="252" w:lineRule="auto"/>
+              <w:jc w:val="center"/>
+            </w:pPr>
+            <w:r>
+              <w:rPr>
+                <w:rFonts w:ascii="Aptos" w:hAnsi="Aptos" w:eastAsia="Aptos"/>
+                <w:b/>
+                <w:i w:val="0"/>
+                <w:color w:val="1F4E78"/>
+                <w:sz w:val="18"/>
+              </w:rPr>
+              <w:t>8</w:t>
+            </w:r>
+          </w:p>
+        </w:tc>
+        <w:tc>
+          <w:tcPr>
+            <w:tcW w:type="dxa" w:w="8731"/>
+            <w:tcBorders>
+              <w:top w:val="single" w:sz="7" w:space="0" w:color="D9D9D9"/>
+              <w:left w:val="single" w:sz="7" w:space="0" w:color="D9D9D9"/>
+              <w:bottom w:val="single" w:sz="7" w:space="0" w:color="D9D9D9"/>
+              <w:right w:val="single" w:sz="7" w:space="0" w:color="D9D9D9"/>
+              <w:insideH w:val="single" w:sz="7" w:space="0" w:color="D9D9D9"/>
+              <w:insideV w:val="single" w:sz="7" w:space="0" w:color="D9D9D9"/>
+            </w:tcBorders>
+            <w:tcMar>
+              <w:top w:w="90" w:type="dxa"/>
+              <w:start w:w="110" w:type="dxa"/>
+              <w:bottom w:w="90" w:type="dxa"/>
+              <w:end w:w="110" w:type="dxa"/>
+            </w:tcMar>
+            <w:vAlign w:val="center"/>
+            <w:shd w:fill="F8FAFC"/>
+          </w:tcPr>
+          <w:p>
+            <w:pPr>
+              <w:keepNext w:val="0"/>
+              <w:spacing w:before="0" w:after="0" w:line="240" w:lineRule="auto"/>
+            </w:pPr>
+            <w:r>
+              <w:rPr>
+                <w:rFonts w:ascii="Aptos" w:hAnsi="Aptos" w:eastAsia="Aptos"/>
+                <w:b w:val="0"/>
+                <w:i w:val="0"/>
+                <w:color w:val="1F2937"/>
+                <w:sz w:val="18"/>
+              </w:rPr>
+              <w:t>wracać; szkoła; kolor; malarski (lub malarka)</w:t>
+            </w:r>
+          </w:p>
+        </w:tc>
+      </w:tr>
+      <w:tr>
+        <w:tc>
+          <w:tcPr>
+            <w:tcW w:type="dxa" w:w="964"/>
+            <w:tcBorders>
+              <w:top w:val="single" w:sz="7" w:space="0" w:color="D9D9D9"/>
+              <w:left w:val="single" w:sz="7" w:space="0" w:color="D9D9D9"/>
+              <w:bottom w:val="single" w:sz="7" w:space="0" w:color="D9D9D9"/>
+              <w:right w:val="single" w:sz="7" w:space="0" w:color="D9D9D9"/>
+              <w:insideH w:val="single" w:sz="7" w:space="0" w:color="D9D9D9"/>
+              <w:insideV w:val="single" w:sz="7" w:space="0" w:color="D9D9D9"/>
+            </w:tcBorders>
+            <w:tcMar>
+              <w:top w:w="90" w:type="dxa"/>
+              <w:start w:w="110" w:type="dxa"/>
+              <w:bottom w:w="90" w:type="dxa"/>
+              <w:end w:w="110" w:type="dxa"/>
+            </w:tcMar>
+            <w:vAlign w:val="center"/>
+          </w:tcPr>
+          <w:p>
+            <w:pPr>
+              <w:keepNext w:val="0"/>
+              <w:spacing w:before="0" w:after="0" w:line="252" w:lineRule="auto"/>
+              <w:jc w:val="center"/>
+            </w:pPr>
+            <w:r>
+              <w:rPr>
+                <w:rFonts w:ascii="Aptos" w:hAnsi="Aptos" w:eastAsia="Aptos"/>
+                <w:b/>
+                <w:i w:val="0"/>
+                <w:color w:val="1F4E78"/>
+                <w:sz w:val="18"/>
+              </w:rPr>
+              <w:t>9</w:t>
+            </w:r>
+          </w:p>
+        </w:tc>
+        <w:tc>
+          <w:tcPr>
+            <w:tcW w:type="dxa" w:w="8731"/>
+            <w:tcBorders>
+              <w:top w:val="single" w:sz="7" w:space="0" w:color="D9D9D9"/>
+              <w:left w:val="single" w:sz="7" w:space="0" w:color="D9D9D9"/>
+              <w:bottom w:val="single" w:sz="7" w:space="0" w:color="D9D9D9"/>
+              <w:right w:val="single" w:sz="7" w:space="0" w:color="D9D9D9"/>
+              <w:insideH w:val="single" w:sz="7" w:space="0" w:color="D9D9D9"/>
+              <w:insideV w:val="single" w:sz="7" w:space="0" w:color="D9D9D9"/>
+            </w:tcBorders>
+            <w:tcMar>
+              <w:top w:w="90" w:type="dxa"/>
+              <w:start w:w="110" w:type="dxa"/>
+              <w:bottom w:w="90" w:type="dxa"/>
+              <w:end w:w="110" w:type="dxa"/>
+            </w:tcMar>
+            <w:vAlign w:val="center"/>
+          </w:tcPr>
+          <w:p>
+            <w:pPr>
+              <w:keepNext w:val="0"/>
+              <w:spacing w:before="0" w:after="0" w:line="240" w:lineRule="auto"/>
+            </w:pPr>
+            <w:r>
+              <w:rPr>
+                <w:rFonts w:ascii="Aptos" w:hAnsi="Aptos" w:eastAsia="Aptos"/>
+                <w:b w:val="0"/>
+                <w:i w:val="0"/>
+                <w:color w:val="1F2937"/>
+                <w:sz w:val="18"/>
+              </w:rPr>
+              <w:t>Antek wiedział, że jego kot dobrze wyszedł, ale wciąż było mu przykro, bo marzył o pierwszym miejscu.</w:t>
+            </w:r>
+          </w:p>
+        </w:tc>
+      </w:tr>
+      <w:tr>
+        <w:tc>
+          <w:tcPr>
+            <w:tcW w:type="dxa" w:w="964"/>
+            <w:tcBorders>
+              <w:top w:val="single" w:sz="7" w:space="0" w:color="D9D9D9"/>
+              <w:left w:val="single" w:sz="7" w:space="0" w:color="D9D9D9"/>
+              <w:bottom w:val="single" w:sz="7" w:space="0" w:color="D9D9D9"/>
+              <w:right w:val="single" w:sz="7" w:space="0" w:color="D9D9D9"/>
+              <w:insideH w:val="single" w:sz="7" w:space="0" w:color="D9D9D9"/>
+              <w:insideV w:val="single" w:sz="7" w:space="0" w:color="D9D9D9"/>
+            </w:tcBorders>
+            <w:tcMar>
+              <w:top w:w="90" w:type="dxa"/>
+              <w:start w:w="110" w:type="dxa"/>
+              <w:bottom w:w="90" w:type="dxa"/>
+              <w:end w:w="110" w:type="dxa"/>
+            </w:tcMar>
+            <w:vAlign w:val="center"/>
+            <w:shd w:fill="F8FAFC"/>
+          </w:tcPr>
+          <w:p>
+            <w:pPr>
+              <w:keepNext w:val="0"/>
+              <w:spacing w:before="0" w:after="0" w:line="252" w:lineRule="auto"/>
+              <w:jc w:val="center"/>
+            </w:pPr>
+            <w:r>
+              <w:rPr>
+                <w:rFonts w:ascii="Aptos" w:hAnsi="Aptos" w:eastAsia="Aptos"/>
+                <w:b/>
+                <w:i w:val="0"/>
+                <w:color w:val="1F4E78"/>
+                <w:sz w:val="18"/>
+              </w:rPr>
+              <w:t>10</w:t>
+            </w:r>
+          </w:p>
+        </w:tc>
+        <w:tc>
+          <w:tcPr>
+            <w:tcW w:type="dxa" w:w="8731"/>
+            <w:tcBorders>
+              <w:top w:val="single" w:sz="7" w:space="0" w:color="D9D9D9"/>
+              <w:left w:val="single" w:sz="7" w:space="0" w:color="D9D9D9"/>
+              <w:bottom w:val="single" w:sz="7" w:space="0" w:color="D9D9D9"/>
+              <w:right w:val="single" w:sz="7" w:space="0" w:color="D9D9D9"/>
+              <w:insideH w:val="single" w:sz="7" w:space="0" w:color="D9D9D9"/>
+              <w:insideV w:val="single" w:sz="7" w:space="0" w:color="D9D9D9"/>
+            </w:tcBorders>
+            <w:tcMar>
+              <w:top w:w="90" w:type="dxa"/>
+              <w:start w:w="110" w:type="dxa"/>
+              <w:bottom w:w="90" w:type="dxa"/>
+              <w:end w:w="110" w:type="dxa"/>
+            </w:tcMar>
+            <w:vAlign w:val="center"/>
+            <w:shd w:fill="F8FAFC"/>
+          </w:tcPr>
+          <w:p>
+            <w:pPr>
+              <w:keepNext w:val="0"/>
+              <w:spacing w:before="0" w:after="0" w:line="240" w:lineRule="auto"/>
+            </w:pPr>
+            <w:r>
+              <w:rPr>
+                <w:rFonts w:ascii="Aptos" w:hAnsi="Aptos" w:eastAsia="Aptos"/>
+                <w:b w:val="0"/>
+                <w:i w:val="0"/>
+                <w:color w:val="1F2937"/>
+                <w:sz w:val="18"/>
+              </w:rPr>
+              <w:t>Krzyknął znaczy głośno, ze złością albo z emocjami; mruknął - cicho, niechętnie, pod nosem. Zmienia się obraz zachowania Antka.</w:t>
+            </w:r>
+          </w:p>
+        </w:tc>
+      </w:tr>
+      <w:tr>
+        <w:tc>
+          <w:tcPr>
+            <w:tcW w:type="dxa" w:w="964"/>
+            <w:tcBorders>
+              <w:top w:val="single" w:sz="7" w:space="0" w:color="D9D9D9"/>
+              <w:left w:val="single" w:sz="7" w:space="0" w:color="D9D9D9"/>
+              <w:bottom w:val="single" w:sz="7" w:space="0" w:color="D9D9D9"/>
+              <w:right w:val="single" w:sz="7" w:space="0" w:color="D9D9D9"/>
+              <w:insideH w:val="single" w:sz="7" w:space="0" w:color="D9D9D9"/>
+              <w:insideV w:val="single" w:sz="7" w:space="0" w:color="D9D9D9"/>
+            </w:tcBorders>
+            <w:tcMar>
+              <w:top w:w="90" w:type="dxa"/>
+              <w:start w:w="110" w:type="dxa"/>
+              <w:bottom w:w="90" w:type="dxa"/>
+              <w:end w:w="110" w:type="dxa"/>
+            </w:tcMar>
+            <w:vAlign w:val="center"/>
+          </w:tcPr>
+          <w:p>
+            <w:pPr>
+              <w:keepNext w:val="0"/>
+              <w:spacing w:before="0" w:after="0" w:line="252" w:lineRule="auto"/>
+              <w:jc w:val="center"/>
+            </w:pPr>
+            <w:r>
+              <w:rPr>
+                <w:rFonts w:ascii="Aptos" w:hAnsi="Aptos" w:eastAsia="Aptos"/>
+                <w:b/>
+                <w:i w:val="0"/>
+                <w:color w:val="1F4E78"/>
+                <w:sz w:val="18"/>
+              </w:rPr>
+              <w:t>11</w:t>
+            </w:r>
+          </w:p>
+        </w:tc>
+        <w:tc>
+          <w:tcPr>
+            <w:tcW w:type="dxa" w:w="8731"/>
+            <w:tcBorders>
+              <w:top w:val="single" w:sz="7" w:space="0" w:color="D9D9D9"/>
+              <w:left w:val="single" w:sz="7" w:space="0" w:color="D9D9D9"/>
+              <w:bottom w:val="single" w:sz="7" w:space="0" w:color="D9D9D9"/>
+              <w:right w:val="single" w:sz="7" w:space="0" w:color="D9D9D9"/>
+              <w:insideH w:val="single" w:sz="7" w:space="0" w:color="D9D9D9"/>
+              <w:insideV w:val="single" w:sz="7" w:space="0" w:color="D9D9D9"/>
+            </w:tcBorders>
+            <w:tcMar>
+              <w:top w:w="90" w:type="dxa"/>
+              <w:start w:w="110" w:type="dxa"/>
+              <w:bottom w:w="90" w:type="dxa"/>
+              <w:end w:w="110" w:type="dxa"/>
+            </w:tcMar>
+            <w:vAlign w:val="center"/>
+          </w:tcPr>
+          <w:p>
+            <w:pPr>
+              <w:keepNext w:val="0"/>
+              <w:spacing w:before="0" w:after="0" w:line="240" w:lineRule="auto"/>
+            </w:pPr>
+            <w:r>
+              <w:rPr>
+                <w:rFonts w:ascii="Aptos" w:hAnsi="Aptos" w:eastAsia="Aptos"/>
+                <w:b w:val="0"/>
+                <w:i w:val="0"/>
+                <w:color w:val="1F2937"/>
+                <w:sz w:val="18"/>
+              </w:rPr>
+              <w:t>Dowolne poprawne zdanie z przecinkiem przed ale albo dlatego, np. Iga wygrała, ale doceniła rysunek Antka.</w:t>
+            </w:r>
+          </w:p>
+        </w:tc>
+      </w:tr>
+      <w:tr>
+        <w:tc>
+          <w:tcPr>
+            <w:tcW w:type="dxa" w:w="964"/>
+            <w:tcBorders>
+              <w:top w:val="single" w:sz="7" w:space="0" w:color="D9D9D9"/>
+              <w:left w:val="single" w:sz="7" w:space="0" w:color="D9D9D9"/>
+              <w:bottom w:val="single" w:sz="7" w:space="0" w:color="D9D9D9"/>
+              <w:right w:val="single" w:sz="7" w:space="0" w:color="D9D9D9"/>
+              <w:insideH w:val="single" w:sz="7" w:space="0" w:color="D9D9D9"/>
+              <w:insideV w:val="single" w:sz="7" w:space="0" w:color="D9D9D9"/>
+            </w:tcBorders>
+            <w:tcMar>
+              <w:top w:w="90" w:type="dxa"/>
+              <w:start w:w="110" w:type="dxa"/>
+              <w:bottom w:w="90" w:type="dxa"/>
+              <w:end w:w="110" w:type="dxa"/>
+            </w:tcMar>
+            <w:vAlign w:val="center"/>
+            <w:shd w:fill="F8FAFC"/>
+          </w:tcPr>
+          <w:p>
+            <w:pPr>
+              <w:keepNext w:val="0"/>
+              <w:spacing w:before="0" w:after="0" w:line="252" w:lineRule="auto"/>
+              <w:jc w:val="center"/>
+            </w:pPr>
+            <w:r>
+              <w:rPr>
+                <w:rFonts w:ascii="Aptos" w:hAnsi="Aptos" w:eastAsia="Aptos"/>
+                <w:b/>
+                <w:i w:val="0"/>
+                <w:color w:val="1F4E78"/>
+                <w:sz w:val="18"/>
+              </w:rPr>
+              <w:t>12</w:t>
+            </w:r>
+          </w:p>
+        </w:tc>
+        <w:tc>
+          <w:tcPr>
+            <w:tcW w:type="dxa" w:w="8731"/>
+            <w:tcBorders>
+              <w:top w:val="single" w:sz="7" w:space="0" w:color="D9D9D9"/>
+              <w:left w:val="single" w:sz="7" w:space="0" w:color="D9D9D9"/>
+              <w:bottom w:val="single" w:sz="7" w:space="0" w:color="D9D9D9"/>
+              <w:right w:val="single" w:sz="7" w:space="0" w:color="D9D9D9"/>
+              <w:insideH w:val="single" w:sz="7" w:space="0" w:color="D9D9D9"/>
+              <w:insideV w:val="single" w:sz="7" w:space="0" w:color="D9D9D9"/>
+            </w:tcBorders>
+            <w:tcMar>
+              <w:top w:w="90" w:type="dxa"/>
+              <w:start w:w="110" w:type="dxa"/>
+              <w:bottom w:w="90" w:type="dxa"/>
+              <w:end w:w="110" w:type="dxa"/>
+            </w:tcMar>
+            <w:vAlign w:val="center"/>
+            <w:shd w:fill="F8FAFC"/>
+          </w:tcPr>
+          <w:p>
+            <w:pPr>
+              <w:keepNext w:val="0"/>
+              <w:spacing w:before="0" w:after="0" w:line="240" w:lineRule="auto"/>
+            </w:pPr>
+            <w:r>
+              <w:rPr>
+                <w:rFonts w:ascii="Aptos" w:hAnsi="Aptos" w:eastAsia="Aptos"/>
+                <w:b w:val="0"/>
+                <w:i w:val="0"/>
+                <w:color w:val="1F2937"/>
+                <w:sz w:val="18"/>
+              </w:rPr>
+              <w:t>Dalszy ciąg pasuje do historii, ma 5-6 zdań i co najmniej dwie wypowiedzi zapisane od nowej linijki z myślnikiem.</w:t>
+            </w:r>
+          </w:p>
+        </w:tc>
+      </w:tr>
+    </w:tbl>
+    <w:p>
+      <w:pPr>
+        <w:pStyle w:val="Heading2"/>
+      </w:pPr>
+      <w:r>
+        <w:rPr>
+          <w:rFonts w:ascii="Aptos" w:hAnsi="Aptos" w:eastAsia="Aptos"/>
+          <w:b/>
+          <w:i w:val="0"/>
+          <w:color w:val="000000"/>
+          <w:sz w:val="23"/>
+        </w:rPr>
+        <w:t>Szybkie omówienie po pracy</w:t>
+      </w:r>
+    </w:p>
+    <w:p>
+      <w:pPr>
+        <w:keepNext w:val="0"/>
+        <w:spacing w:before="0" w:after="0" w:line="252" w:lineRule="auto"/>
+      </w:pPr>
+      <w:r>
+        <w:rPr>
+          <w:rFonts w:ascii="Aptos" w:hAnsi="Aptos" w:eastAsia="Aptos"/>
+          <w:b w:val="0"/>
+          <w:i w:val="0"/>
+          <w:color w:val="1F2937"/>
+          <w:sz w:val="19"/>
+        </w:rPr>
+        <w:t>Poproś uczniów, aby wskazali fragment tekstu potwierdzający odpowiedź, poprawili jedno zadanie i nazwali strategię, która im pomogła.</w:t>
+      </w:r>
+    </w:p>
+    <w:p>
+      <w:r>
+        <w:br w:type="page"/>
+      </w:r>
+    </w:p>
+    <w:p>
+      <w:pPr>
+        <w:pStyle w:val="Heading1"/>
+      </w:pPr>
+      <w:r>
+        <w:rPr>
+          <w:rFonts w:ascii="Aptos" w:hAnsi="Aptos" w:eastAsia="Aptos"/>
+          <w:b/>
+          <w:i w:val="0"/>
+          <w:color w:val="000000"/>
+          <w:sz w:val="26"/>
+        </w:rPr>
+        <w:t>Arkusz 6  Dwie drogi do Afryki</w:t>
+      </w:r>
+    </w:p>
+    <w:tbl>
+      <w:tblPr>
+        <w:tblW w:type="auto" w:w="0"/>
+        <w:jc w:val="center"/>
+        <w:tblLayout w:type="fixed"/>
+        <w:tblLook w:firstColumn="1" w:firstRow="1" w:lastColumn="0" w:lastRow="0" w:noHBand="0" w:noVBand="1" w:val="04A0"/>
+      </w:tblPr>
+      <w:tblGrid>
+        <w:gridCol w:w="964"/>
+        <w:gridCol w:w="8731"/>
+      </w:tblGrid>
+      <w:tr>
+        <w:trPr>
+          <w:tblHeader w:val="true"/>
+        </w:trPr>
+        <w:tc>
+          <w:tcPr>
+            <w:tcW w:type="dxa" w:w="964"/>
+            <w:shd w:fill="1F4E78"/>
+            <w:tcBorders>
+              <w:top w:val="single" w:sz="7" w:space="0" w:color="D9D9D9"/>
+              <w:left w:val="single" w:sz="7" w:space="0" w:color="D9D9D9"/>
+              <w:bottom w:val="single" w:sz="7" w:space="0" w:color="D9D9D9"/>
+              <w:right w:val="single" w:sz="7" w:space="0" w:color="D9D9D9"/>
+              <w:insideH w:val="single" w:sz="7" w:space="0" w:color="D9D9D9"/>
+              <w:insideV w:val="single" w:sz="7" w:space="0" w:color="D9D9D9"/>
+            </w:tcBorders>
+            <w:tcMar>
+              <w:top w:w="105" w:type="dxa"/>
+              <w:start w:w="110" w:type="dxa"/>
+              <w:bottom w:w="105" w:type="dxa"/>
+              <w:end w:w="110" w:type="dxa"/>
+            </w:tcMar>
+          </w:tcPr>
+          <w:p>
+            <w:pPr>
+              <w:keepNext w:val="0"/>
+              <w:spacing w:before="0" w:after="0" w:line="252" w:lineRule="auto"/>
+              <w:jc w:val="center"/>
+            </w:pPr>
+            <w:r>
+              <w:rPr>
+                <w:rFonts w:ascii="Aptos" w:hAnsi="Aptos" w:eastAsia="Aptos"/>
+                <w:b/>
+                <w:i w:val="0"/>
+                <w:color w:val="FFFFFF"/>
+                <w:sz w:val="19"/>
+              </w:rPr>
+              <w:t>Zadanie</w:t>
+            </w:r>
+          </w:p>
+        </w:tc>
+        <w:tc>
+          <w:tcPr>
+            <w:tcW w:type="dxa" w:w="8731"/>
+            <w:shd w:fill="1F4E78"/>
+            <w:tcBorders>
+              <w:top w:val="single" w:sz="7" w:space="0" w:color="D9D9D9"/>
+              <w:left w:val="single" w:sz="7" w:space="0" w:color="D9D9D9"/>
+              <w:bottom w:val="single" w:sz="7" w:space="0" w:color="D9D9D9"/>
+              <w:right w:val="single" w:sz="7" w:space="0" w:color="D9D9D9"/>
+              <w:insideH w:val="single" w:sz="7" w:space="0" w:color="D9D9D9"/>
+              <w:insideV w:val="single" w:sz="7" w:space="0" w:color="D9D9D9"/>
+            </w:tcBorders>
+            <w:tcMar>
+              <w:top w:w="105" w:type="dxa"/>
+              <w:start w:w="110" w:type="dxa"/>
+              <w:bottom w:w="105" w:type="dxa"/>
+              <w:end w:w="110" w:type="dxa"/>
+            </w:tcMar>
+          </w:tcPr>
+          <w:p>
+            <w:pPr>
+              <w:keepNext w:val="0"/>
+              <w:spacing w:before="0" w:after="0" w:line="252" w:lineRule="auto"/>
+              <w:jc w:val="center"/>
+            </w:pPr>
+            <w:r>
+              <w:rPr>
+                <w:rFonts w:ascii="Aptos" w:hAnsi="Aptos" w:eastAsia="Aptos"/>
+                <w:b/>
+                <w:i w:val="0"/>
+                <w:color w:val="FFFFFF"/>
+                <w:sz w:val="19"/>
+              </w:rPr>
+              <w:t>Odpowiedź lub kryterium</w:t>
+            </w:r>
+          </w:p>
+        </w:tc>
+      </w:tr>
+      <w:tr>
+        <w:tc>
+          <w:tcPr>
+            <w:tcW w:type="dxa" w:w="964"/>
+            <w:tcBorders>
+              <w:top w:val="single" w:sz="7" w:space="0" w:color="D9D9D9"/>
+              <w:left w:val="single" w:sz="7" w:space="0" w:color="D9D9D9"/>
+              <w:bottom w:val="single" w:sz="7" w:space="0" w:color="D9D9D9"/>
+              <w:right w:val="single" w:sz="7" w:space="0" w:color="D9D9D9"/>
+              <w:insideH w:val="single" w:sz="7" w:space="0" w:color="D9D9D9"/>
+              <w:insideV w:val="single" w:sz="7" w:space="0" w:color="D9D9D9"/>
+            </w:tcBorders>
+            <w:tcMar>
+              <w:top w:w="90" w:type="dxa"/>
+              <w:start w:w="110" w:type="dxa"/>
+              <w:bottom w:w="90" w:type="dxa"/>
+              <w:end w:w="110" w:type="dxa"/>
+            </w:tcMar>
+            <w:vAlign w:val="center"/>
+          </w:tcPr>
+          <w:p>
+            <w:pPr>
+              <w:keepNext w:val="0"/>
+              <w:spacing w:before="0" w:after="0" w:line="252" w:lineRule="auto"/>
+              <w:jc w:val="center"/>
+            </w:pPr>
+            <w:r>
+              <w:rPr>
+                <w:rFonts w:ascii="Aptos" w:hAnsi="Aptos" w:eastAsia="Aptos"/>
+                <w:b/>
+                <w:i w:val="0"/>
+                <w:color w:val="1F4E78"/>
+                <w:sz w:val="18"/>
+              </w:rPr>
+              <w:t>1</w:t>
+            </w:r>
+          </w:p>
+        </w:tc>
+        <w:tc>
+          <w:tcPr>
+            <w:tcW w:type="dxa" w:w="8731"/>
+            <w:tcBorders>
+              <w:top w:val="single" w:sz="7" w:space="0" w:color="D9D9D9"/>
+              <w:left w:val="single" w:sz="7" w:space="0" w:color="D9D9D9"/>
+              <w:bottom w:val="single" w:sz="7" w:space="0" w:color="D9D9D9"/>
+              <w:right w:val="single" w:sz="7" w:space="0" w:color="D9D9D9"/>
+              <w:insideH w:val="single" w:sz="7" w:space="0" w:color="D9D9D9"/>
+              <w:insideV w:val="single" w:sz="7" w:space="0" w:color="D9D9D9"/>
+            </w:tcBorders>
+            <w:tcMar>
+              <w:top w:w="90" w:type="dxa"/>
+              <w:start w:w="110" w:type="dxa"/>
+              <w:bottom w:w="90" w:type="dxa"/>
+              <w:end w:w="110" w:type="dxa"/>
+            </w:tcMar>
+            <w:vAlign w:val="center"/>
+          </w:tcPr>
+          <w:p>
+            <w:pPr>
+              <w:keepNext w:val="0"/>
+              <w:spacing w:before="0" w:after="0" w:line="240" w:lineRule="auto"/>
+            </w:pPr>
+            <w:r>
+              <w:rPr>
+                <w:rFonts w:ascii="Aptos" w:hAnsi="Aptos" w:eastAsia="Aptos"/>
+                <w:b w:val="0"/>
+                <w:i w:val="0"/>
+                <w:color w:val="1F2937"/>
+                <w:sz w:val="18"/>
+              </w:rPr>
+              <w:t>Zimą brakuje im pokarmu (owadów, żab, dżdżownic). Autor prostuje przekonanie, że ptaki odlatują z powodu zimna.</w:t>
+            </w:r>
+          </w:p>
+        </w:tc>
+      </w:tr>
+      <w:tr>
+        <w:tc>
+          <w:tcPr>
+            <w:tcW w:type="dxa" w:w="964"/>
+            <w:tcBorders>
+              <w:top w:val="single" w:sz="7" w:space="0" w:color="D9D9D9"/>
+              <w:left w:val="single" w:sz="7" w:space="0" w:color="D9D9D9"/>
+              <w:bottom w:val="single" w:sz="7" w:space="0" w:color="D9D9D9"/>
+              <w:right w:val="single" w:sz="7" w:space="0" w:color="D9D9D9"/>
+              <w:insideH w:val="single" w:sz="7" w:space="0" w:color="D9D9D9"/>
+              <w:insideV w:val="single" w:sz="7" w:space="0" w:color="D9D9D9"/>
+            </w:tcBorders>
+            <w:tcMar>
+              <w:top w:w="90" w:type="dxa"/>
+              <w:start w:w="110" w:type="dxa"/>
+              <w:bottom w:w="90" w:type="dxa"/>
+              <w:end w:w="110" w:type="dxa"/>
+            </w:tcMar>
+            <w:vAlign w:val="center"/>
+            <w:shd w:fill="F8FAFC"/>
+          </w:tcPr>
+          <w:p>
+            <w:pPr>
+              <w:keepNext w:val="0"/>
+              <w:spacing w:before="0" w:after="0" w:line="252" w:lineRule="auto"/>
+              <w:jc w:val="center"/>
+            </w:pPr>
+            <w:r>
+              <w:rPr>
+                <w:rFonts w:ascii="Aptos" w:hAnsi="Aptos" w:eastAsia="Aptos"/>
+                <w:b/>
+                <w:i w:val="0"/>
+                <w:color w:val="1F4E78"/>
+                <w:sz w:val="18"/>
+              </w:rPr>
+              <w:t>2</w:t>
+            </w:r>
+          </w:p>
+        </w:tc>
+        <w:tc>
+          <w:tcPr>
+            <w:tcW w:type="dxa" w:w="8731"/>
+            <w:tcBorders>
+              <w:top w:val="single" w:sz="7" w:space="0" w:color="D9D9D9"/>
+              <w:left w:val="single" w:sz="7" w:space="0" w:color="D9D9D9"/>
+              <w:bottom w:val="single" w:sz="7" w:space="0" w:color="D9D9D9"/>
+              <w:right w:val="single" w:sz="7" w:space="0" w:color="D9D9D9"/>
+              <w:insideH w:val="single" w:sz="7" w:space="0" w:color="D9D9D9"/>
+              <w:insideV w:val="single" w:sz="7" w:space="0" w:color="D9D9D9"/>
+            </w:tcBorders>
+            <w:tcMar>
+              <w:top w:w="90" w:type="dxa"/>
+              <w:start w:w="110" w:type="dxa"/>
+              <w:bottom w:w="90" w:type="dxa"/>
+              <w:end w:w="110" w:type="dxa"/>
+            </w:tcMar>
+            <w:vAlign w:val="center"/>
+            <w:shd w:fill="F8FAFC"/>
+          </w:tcPr>
+          <w:p>
+            <w:pPr>
+              <w:keepNext w:val="0"/>
+              <w:spacing w:before="0" w:after="0" w:line="240" w:lineRule="auto"/>
+            </w:pPr>
+            <w:r>
+              <w:rPr>
+                <w:rFonts w:ascii="Aptos" w:hAnsi="Aptos" w:eastAsia="Aptos"/>
+                <w:b w:val="0"/>
+                <w:i w:val="0"/>
+                <w:color w:val="1F2937"/>
+                <w:sz w:val="18"/>
+              </w:rPr>
+              <w:t>budowa: bocian ciężki, szerokie skrzydła / jaskółka lekka, zwinna; lot: bocian szybuje na prądach ciepłego powietrza / jaskółka macha skrzydłami; nad morzem: bocian omija morze / jaskółka przelatuje nad morzem.</w:t>
+            </w:r>
+          </w:p>
+        </w:tc>
+      </w:tr>
+      <w:tr>
+        <w:tc>
+          <w:tcPr>
+            <w:tcW w:type="dxa" w:w="964"/>
+            <w:tcBorders>
+              <w:top w:val="single" w:sz="7" w:space="0" w:color="D9D9D9"/>
+              <w:left w:val="single" w:sz="7" w:space="0" w:color="D9D9D9"/>
+              <w:bottom w:val="single" w:sz="7" w:space="0" w:color="D9D9D9"/>
+              <w:right w:val="single" w:sz="7" w:space="0" w:color="D9D9D9"/>
+              <w:insideH w:val="single" w:sz="7" w:space="0" w:color="D9D9D9"/>
+              <w:insideV w:val="single" w:sz="7" w:space="0" w:color="D9D9D9"/>
+            </w:tcBorders>
+            <w:tcMar>
+              <w:top w:w="90" w:type="dxa"/>
+              <w:start w:w="110" w:type="dxa"/>
+              <w:bottom w:w="90" w:type="dxa"/>
+              <w:end w:w="110" w:type="dxa"/>
+            </w:tcMar>
+            <w:vAlign w:val="center"/>
+          </w:tcPr>
+          <w:p>
+            <w:pPr>
+              <w:keepNext w:val="0"/>
+              <w:spacing w:before="0" w:after="0" w:line="252" w:lineRule="auto"/>
+              <w:jc w:val="center"/>
+            </w:pPr>
+            <w:r>
+              <w:rPr>
+                <w:rFonts w:ascii="Aptos" w:hAnsi="Aptos" w:eastAsia="Aptos"/>
+                <w:b/>
+                <w:i w:val="0"/>
+                <w:color w:val="1F4E78"/>
+                <w:sz w:val="18"/>
+              </w:rPr>
+              <w:t>3</w:t>
+            </w:r>
+          </w:p>
+        </w:tc>
+        <w:tc>
+          <w:tcPr>
+            <w:tcW w:type="dxa" w:w="8731"/>
+            <w:tcBorders>
+              <w:top w:val="single" w:sz="7" w:space="0" w:color="D9D9D9"/>
+              <w:left w:val="single" w:sz="7" w:space="0" w:color="D9D9D9"/>
+              <w:bottom w:val="single" w:sz="7" w:space="0" w:color="D9D9D9"/>
+              <w:right w:val="single" w:sz="7" w:space="0" w:color="D9D9D9"/>
+              <w:insideH w:val="single" w:sz="7" w:space="0" w:color="D9D9D9"/>
+              <w:insideV w:val="single" w:sz="7" w:space="0" w:color="D9D9D9"/>
+            </w:tcBorders>
+            <w:tcMar>
+              <w:top w:w="90" w:type="dxa"/>
+              <w:start w:w="110" w:type="dxa"/>
+              <w:bottom w:w="90" w:type="dxa"/>
+              <w:end w:w="110" w:type="dxa"/>
+            </w:tcMar>
+            <w:vAlign w:val="center"/>
+          </w:tcPr>
+          <w:p>
+            <w:pPr>
+              <w:keepNext w:val="0"/>
+              <w:spacing w:before="0" w:after="0" w:line="240" w:lineRule="auto"/>
+            </w:pPr>
+            <w:r>
+              <w:rPr>
+                <w:rFonts w:ascii="Aptos" w:hAnsi="Aptos" w:eastAsia="Aptos"/>
+                <w:b w:val="0"/>
+                <w:i w:val="0"/>
+                <w:color w:val="1F2937"/>
+                <w:sz w:val="18"/>
+              </w:rPr>
+              <w:t>Bocian jest ciężki i musi szybować na prądach ciepłego powietrza, a nad morzem takich prądów prawie nie ma (informacje z 2. akapitu).</w:t>
+            </w:r>
+          </w:p>
+        </w:tc>
+      </w:tr>
+      <w:tr>
+        <w:tc>
+          <w:tcPr>
+            <w:tcW w:type="dxa" w:w="964"/>
+            <w:tcBorders>
+              <w:top w:val="single" w:sz="7" w:space="0" w:color="D9D9D9"/>
+              <w:left w:val="single" w:sz="7" w:space="0" w:color="D9D9D9"/>
+              <w:bottom w:val="single" w:sz="7" w:space="0" w:color="D9D9D9"/>
+              <w:right w:val="single" w:sz="7" w:space="0" w:color="D9D9D9"/>
+              <w:insideH w:val="single" w:sz="7" w:space="0" w:color="D9D9D9"/>
+              <w:insideV w:val="single" w:sz="7" w:space="0" w:color="D9D9D9"/>
+            </w:tcBorders>
+            <w:tcMar>
+              <w:top w:w="90" w:type="dxa"/>
+              <w:start w:w="110" w:type="dxa"/>
+              <w:bottom w:w="90" w:type="dxa"/>
+              <w:end w:w="110" w:type="dxa"/>
+            </w:tcMar>
+            <w:vAlign w:val="center"/>
+            <w:shd w:fill="F8FAFC"/>
+          </w:tcPr>
+          <w:p>
+            <w:pPr>
+              <w:keepNext w:val="0"/>
+              <w:spacing w:before="0" w:after="0" w:line="252" w:lineRule="auto"/>
+              <w:jc w:val="center"/>
+            </w:pPr>
+            <w:r>
+              <w:rPr>
+                <w:rFonts w:ascii="Aptos" w:hAnsi="Aptos" w:eastAsia="Aptos"/>
+                <w:b/>
+                <w:i w:val="0"/>
+                <w:color w:val="1F4E78"/>
+                <w:sz w:val="18"/>
+              </w:rPr>
+              <w:t>4</w:t>
+            </w:r>
+          </w:p>
+        </w:tc>
+        <w:tc>
+          <w:tcPr>
+            <w:tcW w:type="dxa" w:w="8731"/>
+            <w:tcBorders>
+              <w:top w:val="single" w:sz="7" w:space="0" w:color="D9D9D9"/>
+              <w:left w:val="single" w:sz="7" w:space="0" w:color="D9D9D9"/>
+              <w:bottom w:val="single" w:sz="7" w:space="0" w:color="D9D9D9"/>
+              <w:right w:val="single" w:sz="7" w:space="0" w:color="D9D9D9"/>
+              <w:insideH w:val="single" w:sz="7" w:space="0" w:color="D9D9D9"/>
+              <w:insideV w:val="single" w:sz="7" w:space="0" w:color="D9D9D9"/>
+            </w:tcBorders>
+            <w:tcMar>
+              <w:top w:w="90" w:type="dxa"/>
+              <w:start w:w="110" w:type="dxa"/>
+              <w:bottom w:w="90" w:type="dxa"/>
+              <w:end w:w="110" w:type="dxa"/>
+            </w:tcMar>
+            <w:vAlign w:val="center"/>
+            <w:shd w:fill="F8FAFC"/>
+          </w:tcPr>
+          <w:p>
+            <w:pPr>
+              <w:keepNext w:val="0"/>
+              <w:spacing w:before="0" w:after="0" w:line="240" w:lineRule="auto"/>
+            </w:pPr>
+            <w:r>
+              <w:rPr>
+                <w:rFonts w:ascii="Aptos" w:hAnsi="Aptos" w:eastAsia="Aptos"/>
+                <w:b w:val="0"/>
+                <w:i w:val="0"/>
+                <w:color w:val="1F2937"/>
+                <w:sz w:val="18"/>
+              </w:rPr>
+              <w:t>F, F (młode często startują przed dorosłymi), ?</w:t>
+            </w:r>
+          </w:p>
+        </w:tc>
+      </w:tr>
+      <w:tr>
+        <w:tc>
+          <w:tcPr>
+            <w:tcW w:type="dxa" w:w="964"/>
+            <w:tcBorders>
+              <w:top w:val="single" w:sz="7" w:space="0" w:color="D9D9D9"/>
+              <w:left w:val="single" w:sz="7" w:space="0" w:color="D9D9D9"/>
+              <w:bottom w:val="single" w:sz="7" w:space="0" w:color="D9D9D9"/>
+              <w:right w:val="single" w:sz="7" w:space="0" w:color="D9D9D9"/>
+              <w:insideH w:val="single" w:sz="7" w:space="0" w:color="D9D9D9"/>
+              <w:insideV w:val="single" w:sz="7" w:space="0" w:color="D9D9D9"/>
+            </w:tcBorders>
+            <w:tcMar>
+              <w:top w:w="90" w:type="dxa"/>
+              <w:start w:w="110" w:type="dxa"/>
+              <w:bottom w:w="90" w:type="dxa"/>
+              <w:end w:w="110" w:type="dxa"/>
+            </w:tcMar>
+            <w:vAlign w:val="center"/>
+          </w:tcPr>
+          <w:p>
+            <w:pPr>
+              <w:keepNext w:val="0"/>
+              <w:spacing w:before="0" w:after="0" w:line="252" w:lineRule="auto"/>
+              <w:jc w:val="center"/>
+            </w:pPr>
+            <w:r>
+              <w:rPr>
+                <w:rFonts w:ascii="Aptos" w:hAnsi="Aptos" w:eastAsia="Aptos"/>
+                <w:b/>
+                <w:i w:val="0"/>
+                <w:color w:val="1F4E78"/>
+                <w:sz w:val="18"/>
+              </w:rPr>
+              <w:t>5</w:t>
+            </w:r>
+          </w:p>
+        </w:tc>
+        <w:tc>
+          <w:tcPr>
+            <w:tcW w:type="dxa" w:w="8731"/>
+            <w:tcBorders>
+              <w:top w:val="single" w:sz="7" w:space="0" w:color="D9D9D9"/>
+              <w:left w:val="single" w:sz="7" w:space="0" w:color="D9D9D9"/>
+              <w:bottom w:val="single" w:sz="7" w:space="0" w:color="D9D9D9"/>
+              <w:right w:val="single" w:sz="7" w:space="0" w:color="D9D9D9"/>
+              <w:insideH w:val="single" w:sz="7" w:space="0" w:color="D9D9D9"/>
+              <w:insideV w:val="single" w:sz="7" w:space="0" w:color="D9D9D9"/>
+            </w:tcBorders>
+            <w:tcMar>
+              <w:top w:w="90" w:type="dxa"/>
+              <w:start w:w="110" w:type="dxa"/>
+              <w:bottom w:w="90" w:type="dxa"/>
+              <w:end w:w="110" w:type="dxa"/>
+            </w:tcMar>
+            <w:vAlign w:val="center"/>
+          </w:tcPr>
+          <w:p>
+            <w:pPr>
+              <w:keepNext w:val="0"/>
+              <w:spacing w:before="0" w:after="0" w:line="240" w:lineRule="auto"/>
+            </w:pPr>
+            <w:r>
+              <w:rPr>
+                <w:rFonts w:ascii="Aptos" w:hAnsi="Aptos" w:eastAsia="Aptos"/>
+                <w:b w:val="0"/>
+                <w:i w:val="0"/>
+                <w:color w:val="1F2937"/>
+                <w:sz w:val="18"/>
+              </w:rPr>
+              <w:t>Żeby wyjaśnić trudną rzecz czymś, co czytelnik zna.</w:t>
+            </w:r>
+          </w:p>
+        </w:tc>
+      </w:tr>
+      <w:tr>
+        <w:tc>
+          <w:tcPr>
+            <w:tcW w:type="dxa" w:w="964"/>
+            <w:tcBorders>
+              <w:top w:val="single" w:sz="7" w:space="0" w:color="D9D9D9"/>
+              <w:left w:val="single" w:sz="7" w:space="0" w:color="D9D9D9"/>
+              <w:bottom w:val="single" w:sz="7" w:space="0" w:color="D9D9D9"/>
+              <w:right w:val="single" w:sz="7" w:space="0" w:color="D9D9D9"/>
+              <w:insideH w:val="single" w:sz="7" w:space="0" w:color="D9D9D9"/>
+              <w:insideV w:val="single" w:sz="7" w:space="0" w:color="D9D9D9"/>
+            </w:tcBorders>
+            <w:tcMar>
+              <w:top w:w="90" w:type="dxa"/>
+              <w:start w:w="110" w:type="dxa"/>
+              <w:bottom w:w="90" w:type="dxa"/>
+              <w:end w:w="110" w:type="dxa"/>
+            </w:tcMar>
+            <w:vAlign w:val="center"/>
+            <w:shd w:fill="F8FAFC"/>
+          </w:tcPr>
+          <w:p>
+            <w:pPr>
+              <w:keepNext w:val="0"/>
+              <w:spacing w:before="0" w:after="0" w:line="252" w:lineRule="auto"/>
+              <w:jc w:val="center"/>
+            </w:pPr>
+            <w:r>
+              <w:rPr>
+                <w:rFonts w:ascii="Aptos" w:hAnsi="Aptos" w:eastAsia="Aptos"/>
+                <w:b/>
+                <w:i w:val="0"/>
+                <w:color w:val="1F4E78"/>
+                <w:sz w:val="18"/>
+              </w:rPr>
+              <w:t>6</w:t>
+            </w:r>
+          </w:p>
+        </w:tc>
+        <w:tc>
+          <w:tcPr>
+            <w:tcW w:type="dxa" w:w="8731"/>
+            <w:tcBorders>
+              <w:top w:val="single" w:sz="7" w:space="0" w:color="D9D9D9"/>
+              <w:left w:val="single" w:sz="7" w:space="0" w:color="D9D9D9"/>
+              <w:bottom w:val="single" w:sz="7" w:space="0" w:color="D9D9D9"/>
+              <w:right w:val="single" w:sz="7" w:space="0" w:color="D9D9D9"/>
+              <w:insideH w:val="single" w:sz="7" w:space="0" w:color="D9D9D9"/>
+              <w:insideV w:val="single" w:sz="7" w:space="0" w:color="D9D9D9"/>
+            </w:tcBorders>
+            <w:tcMar>
+              <w:top w:w="90" w:type="dxa"/>
+              <w:start w:w="110" w:type="dxa"/>
+              <w:bottom w:w="90" w:type="dxa"/>
+              <w:end w:w="110" w:type="dxa"/>
+            </w:tcMar>
+            <w:vAlign w:val="center"/>
+            <w:shd w:fill="F8FAFC"/>
+          </w:tcPr>
+          <w:p>
+            <w:pPr>
+              <w:keepNext w:val="0"/>
+              <w:spacing w:before="0" w:after="0" w:line="240" w:lineRule="auto"/>
+            </w:pPr>
+            <w:r>
+              <w:rPr>
+                <w:rFonts w:ascii="Aptos" w:hAnsi="Aptos" w:eastAsia="Aptos"/>
+                <w:b w:val="0"/>
+                <w:i w:val="0"/>
+                <w:color w:val="1F2937"/>
+                <w:sz w:val="18"/>
+              </w:rPr>
+              <w:t>Dwa spośród: zmęczenie, brak pokarmu, zgubienie drogi, przelot nad pustynią lub morzem, samotna droga młodych bocianów.</w:t>
+            </w:r>
+          </w:p>
+        </w:tc>
+      </w:tr>
+      <w:tr>
+        <w:tc>
+          <w:tcPr>
+            <w:tcW w:type="dxa" w:w="964"/>
+            <w:tcBorders>
+              <w:top w:val="single" w:sz="7" w:space="0" w:color="D9D9D9"/>
+              <w:left w:val="single" w:sz="7" w:space="0" w:color="D9D9D9"/>
+              <w:bottom w:val="single" w:sz="7" w:space="0" w:color="D9D9D9"/>
+              <w:right w:val="single" w:sz="7" w:space="0" w:color="D9D9D9"/>
+              <w:insideH w:val="single" w:sz="7" w:space="0" w:color="D9D9D9"/>
+              <w:insideV w:val="single" w:sz="7" w:space="0" w:color="D9D9D9"/>
+            </w:tcBorders>
+            <w:tcMar>
+              <w:top w:w="90" w:type="dxa"/>
+              <w:start w:w="110" w:type="dxa"/>
+              <w:bottom w:w="90" w:type="dxa"/>
+              <w:end w:w="110" w:type="dxa"/>
+            </w:tcMar>
+            <w:vAlign w:val="center"/>
+          </w:tcPr>
+          <w:p>
+            <w:pPr>
+              <w:keepNext w:val="0"/>
+              <w:spacing w:before="0" w:after="0" w:line="252" w:lineRule="auto"/>
+              <w:jc w:val="center"/>
+            </w:pPr>
+            <w:r>
+              <w:rPr>
+                <w:rFonts w:ascii="Aptos" w:hAnsi="Aptos" w:eastAsia="Aptos"/>
+                <w:b/>
+                <w:i w:val="0"/>
+                <w:color w:val="1F4E78"/>
+                <w:sz w:val="18"/>
+              </w:rPr>
+              <w:t>7</w:t>
+            </w:r>
+          </w:p>
+        </w:tc>
+        <w:tc>
+          <w:tcPr>
+            <w:tcW w:type="dxa" w:w="8731"/>
+            <w:tcBorders>
+              <w:top w:val="single" w:sz="7" w:space="0" w:color="D9D9D9"/>
+              <w:left w:val="single" w:sz="7" w:space="0" w:color="D9D9D9"/>
+              <w:bottom w:val="single" w:sz="7" w:space="0" w:color="D9D9D9"/>
+              <w:right w:val="single" w:sz="7" w:space="0" w:color="D9D9D9"/>
+              <w:insideH w:val="single" w:sz="7" w:space="0" w:color="D9D9D9"/>
+              <w:insideV w:val="single" w:sz="7" w:space="0" w:color="D9D9D9"/>
+            </w:tcBorders>
+            <w:tcMar>
+              <w:top w:w="90" w:type="dxa"/>
+              <w:start w:w="110" w:type="dxa"/>
+              <w:bottom w:w="90" w:type="dxa"/>
+              <w:end w:w="110" w:type="dxa"/>
+            </w:tcMar>
+            <w:vAlign w:val="center"/>
+          </w:tcPr>
+          <w:p>
+            <w:pPr>
+              <w:keepNext w:val="0"/>
+              <w:spacing w:before="0" w:after="0" w:line="240" w:lineRule="auto"/>
+            </w:pPr>
+            <w:r>
+              <w:rPr>
+                <w:rFonts w:ascii="Aptos" w:hAnsi="Aptos" w:eastAsia="Aptos"/>
+                <w:b w:val="0"/>
+                <w:i w:val="0"/>
+                <w:color w:val="1F2937"/>
+                <w:sz w:val="18"/>
+              </w:rPr>
+              <w:t>zimowy, ptasi, afrykański (mała litera), morski, słoneczny</w:t>
+            </w:r>
+          </w:p>
+        </w:tc>
+      </w:tr>
+      <w:tr>
+        <w:tc>
+          <w:tcPr>
+            <w:tcW w:type="dxa" w:w="964"/>
+            <w:tcBorders>
+              <w:top w:val="single" w:sz="7" w:space="0" w:color="D9D9D9"/>
+              <w:left w:val="single" w:sz="7" w:space="0" w:color="D9D9D9"/>
+              <w:bottom w:val="single" w:sz="7" w:space="0" w:color="D9D9D9"/>
+              <w:right w:val="single" w:sz="7" w:space="0" w:color="D9D9D9"/>
+              <w:insideH w:val="single" w:sz="7" w:space="0" w:color="D9D9D9"/>
+              <w:insideV w:val="single" w:sz="7" w:space="0" w:color="D9D9D9"/>
+            </w:tcBorders>
+            <w:tcMar>
+              <w:top w:w="90" w:type="dxa"/>
+              <w:start w:w="110" w:type="dxa"/>
+              <w:bottom w:w="90" w:type="dxa"/>
+              <w:end w:w="110" w:type="dxa"/>
+            </w:tcMar>
+            <w:vAlign w:val="center"/>
+            <w:shd w:fill="F8FAFC"/>
+          </w:tcPr>
+          <w:p>
+            <w:pPr>
+              <w:keepNext w:val="0"/>
+              <w:spacing w:before="0" w:after="0" w:line="252" w:lineRule="auto"/>
+              <w:jc w:val="center"/>
+            </w:pPr>
+            <w:r>
+              <w:rPr>
+                <w:rFonts w:ascii="Aptos" w:hAnsi="Aptos" w:eastAsia="Aptos"/>
+                <w:b/>
+                <w:i w:val="0"/>
+                <w:color w:val="1F4E78"/>
+                <w:sz w:val="18"/>
+              </w:rPr>
+              <w:t>8</w:t>
+            </w:r>
+          </w:p>
+        </w:tc>
+        <w:tc>
+          <w:tcPr>
+            <w:tcW w:type="dxa" w:w="8731"/>
+            <w:tcBorders>
+              <w:top w:val="single" w:sz="7" w:space="0" w:color="D9D9D9"/>
+              <w:left w:val="single" w:sz="7" w:space="0" w:color="D9D9D9"/>
+              <w:bottom w:val="single" w:sz="7" w:space="0" w:color="D9D9D9"/>
+              <w:right w:val="single" w:sz="7" w:space="0" w:color="D9D9D9"/>
+              <w:insideH w:val="single" w:sz="7" w:space="0" w:color="D9D9D9"/>
+              <w:insideV w:val="single" w:sz="7" w:space="0" w:color="D9D9D9"/>
+            </w:tcBorders>
+            <w:tcMar>
+              <w:top w:w="90" w:type="dxa"/>
+              <w:start w:w="110" w:type="dxa"/>
+              <w:bottom w:w="90" w:type="dxa"/>
+              <w:end w:w="110" w:type="dxa"/>
+            </w:tcMar>
+            <w:vAlign w:val="center"/>
+            <w:shd w:fill="F8FAFC"/>
+          </w:tcPr>
+          <w:p>
+            <w:pPr>
+              <w:keepNext w:val="0"/>
+              <w:spacing w:before="0" w:after="0" w:line="240" w:lineRule="auto"/>
+            </w:pPr>
+            <w:r>
+              <w:rPr>
+                <w:rFonts w:ascii="Aptos" w:hAnsi="Aptos" w:eastAsia="Aptos"/>
+                <w:b w:val="0"/>
+                <w:i w:val="0"/>
+                <w:color w:val="1F2937"/>
+                <w:sz w:val="18"/>
+              </w:rPr>
+              <w:t>żaby, dżdżownice, przewody, wyruszają, morze, żółty</w:t>
+            </w:r>
+          </w:p>
+        </w:tc>
+      </w:tr>
+      <w:tr>
+        <w:tc>
+          <w:tcPr>
+            <w:tcW w:type="dxa" w:w="964"/>
+            <w:tcBorders>
+              <w:top w:val="single" w:sz="7" w:space="0" w:color="D9D9D9"/>
+              <w:left w:val="single" w:sz="7" w:space="0" w:color="D9D9D9"/>
+              <w:bottom w:val="single" w:sz="7" w:space="0" w:color="D9D9D9"/>
+              <w:right w:val="single" w:sz="7" w:space="0" w:color="D9D9D9"/>
+              <w:insideH w:val="single" w:sz="7" w:space="0" w:color="D9D9D9"/>
+              <w:insideV w:val="single" w:sz="7" w:space="0" w:color="D9D9D9"/>
+            </w:tcBorders>
+            <w:tcMar>
+              <w:top w:w="90" w:type="dxa"/>
+              <w:start w:w="110" w:type="dxa"/>
+              <w:bottom w:w="90" w:type="dxa"/>
+              <w:end w:w="110" w:type="dxa"/>
+            </w:tcMar>
+            <w:vAlign w:val="center"/>
+          </w:tcPr>
+          <w:p>
+            <w:pPr>
+              <w:keepNext w:val="0"/>
+              <w:spacing w:before="0" w:after="0" w:line="252" w:lineRule="auto"/>
+              <w:jc w:val="center"/>
+            </w:pPr>
+            <w:r>
+              <w:rPr>
+                <w:rFonts w:ascii="Aptos" w:hAnsi="Aptos" w:eastAsia="Aptos"/>
+                <w:b/>
+                <w:i w:val="0"/>
+                <w:color w:val="1F4E78"/>
+                <w:sz w:val="18"/>
+              </w:rPr>
+              <w:t>9</w:t>
+            </w:r>
+          </w:p>
+        </w:tc>
+        <w:tc>
+          <w:tcPr>
+            <w:tcW w:type="dxa" w:w="8731"/>
+            <w:tcBorders>
+              <w:top w:val="single" w:sz="7" w:space="0" w:color="D9D9D9"/>
+              <w:left w:val="single" w:sz="7" w:space="0" w:color="D9D9D9"/>
+              <w:bottom w:val="single" w:sz="7" w:space="0" w:color="D9D9D9"/>
+              <w:right w:val="single" w:sz="7" w:space="0" w:color="D9D9D9"/>
+              <w:insideH w:val="single" w:sz="7" w:space="0" w:color="D9D9D9"/>
+              <w:insideV w:val="single" w:sz="7" w:space="0" w:color="D9D9D9"/>
+            </w:tcBorders>
+            <w:tcMar>
+              <w:top w:w="90" w:type="dxa"/>
+              <w:start w:w="110" w:type="dxa"/>
+              <w:bottom w:w="90" w:type="dxa"/>
+              <w:end w:w="110" w:type="dxa"/>
+            </w:tcMar>
+            <w:vAlign w:val="center"/>
+          </w:tcPr>
+          <w:p>
+            <w:pPr>
+              <w:keepNext w:val="0"/>
+              <w:spacing w:before="0" w:after="0" w:line="240" w:lineRule="auto"/>
+            </w:pPr>
+            <w:r>
+              <w:rPr>
+                <w:rFonts w:ascii="Aptos" w:hAnsi="Aptos" w:eastAsia="Aptos"/>
+                <w:b w:val="0"/>
+                <w:i w:val="0"/>
+                <w:color w:val="1F2937"/>
+                <w:sz w:val="18"/>
+              </w:rPr>
+              <w:t>ptaków, ptakom, ptakach</w:t>
+            </w:r>
+          </w:p>
+        </w:tc>
+      </w:tr>
+      <w:tr>
+        <w:tc>
+          <w:tcPr>
+            <w:tcW w:type="dxa" w:w="964"/>
+            <w:tcBorders>
+              <w:top w:val="single" w:sz="7" w:space="0" w:color="D9D9D9"/>
+              <w:left w:val="single" w:sz="7" w:space="0" w:color="D9D9D9"/>
+              <w:bottom w:val="single" w:sz="7" w:space="0" w:color="D9D9D9"/>
+              <w:right w:val="single" w:sz="7" w:space="0" w:color="D9D9D9"/>
+              <w:insideH w:val="single" w:sz="7" w:space="0" w:color="D9D9D9"/>
+              <w:insideV w:val="single" w:sz="7" w:space="0" w:color="D9D9D9"/>
+            </w:tcBorders>
+            <w:tcMar>
+              <w:top w:w="90" w:type="dxa"/>
+              <w:start w:w="110" w:type="dxa"/>
+              <w:bottom w:w="90" w:type="dxa"/>
+              <w:end w:w="110" w:type="dxa"/>
+            </w:tcMar>
+            <w:vAlign w:val="center"/>
+            <w:shd w:fill="F8FAFC"/>
+          </w:tcPr>
+          <w:p>
+            <w:pPr>
+              <w:keepNext w:val="0"/>
+              <w:spacing w:before="0" w:after="0" w:line="252" w:lineRule="auto"/>
+              <w:jc w:val="center"/>
+            </w:pPr>
+            <w:r>
+              <w:rPr>
+                <w:rFonts w:ascii="Aptos" w:hAnsi="Aptos" w:eastAsia="Aptos"/>
+                <w:b/>
+                <w:i w:val="0"/>
+                <w:color w:val="1F4E78"/>
+                <w:sz w:val="18"/>
+              </w:rPr>
+              <w:t>10</w:t>
+            </w:r>
+          </w:p>
+        </w:tc>
+        <w:tc>
+          <w:tcPr>
+            <w:tcW w:type="dxa" w:w="8731"/>
+            <w:tcBorders>
+              <w:top w:val="single" w:sz="7" w:space="0" w:color="D9D9D9"/>
+              <w:left w:val="single" w:sz="7" w:space="0" w:color="D9D9D9"/>
+              <w:bottom w:val="single" w:sz="7" w:space="0" w:color="D9D9D9"/>
+              <w:right w:val="single" w:sz="7" w:space="0" w:color="D9D9D9"/>
+              <w:insideH w:val="single" w:sz="7" w:space="0" w:color="D9D9D9"/>
+              <w:insideV w:val="single" w:sz="7" w:space="0" w:color="D9D9D9"/>
+            </w:tcBorders>
+            <w:tcMar>
+              <w:top w:w="90" w:type="dxa"/>
+              <w:start w:w="110" w:type="dxa"/>
+              <w:bottom w:w="90" w:type="dxa"/>
+              <w:end w:w="110" w:type="dxa"/>
+            </w:tcMar>
+            <w:vAlign w:val="center"/>
+            <w:shd w:fill="F8FAFC"/>
+          </w:tcPr>
+          <w:p>
+            <w:pPr>
+              <w:keepNext w:val="0"/>
+              <w:spacing w:before="0" w:after="0" w:line="240" w:lineRule="auto"/>
+            </w:pPr>
+            <w:r>
+              <w:rPr>
+                <w:rFonts w:ascii="Aptos" w:hAnsi="Aptos" w:eastAsia="Aptos"/>
+                <w:b w:val="0"/>
+                <w:i w:val="0"/>
+                <w:color w:val="1F2937"/>
+                <w:sz w:val="18"/>
+              </w:rPr>
+              <w:t>Zimą brakuje owadów, więc jaskółki odlatują do Afryki. Jaskółki odlatują do Afryki, ponieważ zimą brakuje owadów. Zwrócić uwagę na odwrotną kolejność zdań.</w:t>
+            </w:r>
+          </w:p>
+        </w:tc>
+      </w:tr>
+      <w:tr>
+        <w:tc>
+          <w:tcPr>
+            <w:tcW w:type="dxa" w:w="964"/>
+            <w:tcBorders>
+              <w:top w:val="single" w:sz="7" w:space="0" w:color="D9D9D9"/>
+              <w:left w:val="single" w:sz="7" w:space="0" w:color="D9D9D9"/>
+              <w:bottom w:val="single" w:sz="7" w:space="0" w:color="D9D9D9"/>
+              <w:right w:val="single" w:sz="7" w:space="0" w:color="D9D9D9"/>
+              <w:insideH w:val="single" w:sz="7" w:space="0" w:color="D9D9D9"/>
+              <w:insideV w:val="single" w:sz="7" w:space="0" w:color="D9D9D9"/>
+            </w:tcBorders>
+            <w:tcMar>
+              <w:top w:w="90" w:type="dxa"/>
+              <w:start w:w="110" w:type="dxa"/>
+              <w:bottom w:w="90" w:type="dxa"/>
+              <w:end w:w="110" w:type="dxa"/>
+            </w:tcMar>
+            <w:vAlign w:val="center"/>
+          </w:tcPr>
+          <w:p>
+            <w:pPr>
+              <w:keepNext w:val="0"/>
+              <w:spacing w:before="0" w:after="0" w:line="252" w:lineRule="auto"/>
+              <w:jc w:val="center"/>
+            </w:pPr>
+            <w:r>
+              <w:rPr>
+                <w:rFonts w:ascii="Aptos" w:hAnsi="Aptos" w:eastAsia="Aptos"/>
+                <w:b/>
+                <w:i w:val="0"/>
+                <w:color w:val="1F4E78"/>
+                <w:sz w:val="18"/>
+              </w:rPr>
+              <w:t>11</w:t>
+            </w:r>
+          </w:p>
+        </w:tc>
+        <w:tc>
+          <w:tcPr>
+            <w:tcW w:type="dxa" w:w="8731"/>
+            <w:tcBorders>
+              <w:top w:val="single" w:sz="7" w:space="0" w:color="D9D9D9"/>
+              <w:left w:val="single" w:sz="7" w:space="0" w:color="D9D9D9"/>
+              <w:bottom w:val="single" w:sz="7" w:space="0" w:color="D9D9D9"/>
+              <w:right w:val="single" w:sz="7" w:space="0" w:color="D9D9D9"/>
+              <w:insideH w:val="single" w:sz="7" w:space="0" w:color="D9D9D9"/>
+              <w:insideV w:val="single" w:sz="7" w:space="0" w:color="D9D9D9"/>
+            </w:tcBorders>
+            <w:tcMar>
+              <w:top w:w="90" w:type="dxa"/>
+              <w:start w:w="110" w:type="dxa"/>
+              <w:bottom w:w="90" w:type="dxa"/>
+              <w:end w:w="110" w:type="dxa"/>
+            </w:tcMar>
+            <w:vAlign w:val="center"/>
+          </w:tcPr>
+          <w:p>
+            <w:pPr>
+              <w:keepNext w:val="0"/>
+              <w:spacing w:before="0" w:after="0" w:line="240" w:lineRule="auto"/>
+            </w:pPr>
+            <w:r>
+              <w:rPr>
+                <w:rFonts w:ascii="Aptos" w:hAnsi="Aptos" w:eastAsia="Aptos"/>
+                <w:b w:val="0"/>
+                <w:i w:val="0"/>
+                <w:color w:val="1F2937"/>
+                <w:sz w:val="18"/>
+              </w:rPr>
+              <w:t>Na przykład: igła do szycia, igła sosny lub świerku, igła strzykawki.</w:t>
+            </w:r>
+          </w:p>
+        </w:tc>
+      </w:tr>
+      <w:tr>
+        <w:tc>
+          <w:tcPr>
+            <w:tcW w:type="dxa" w:w="964"/>
+            <w:tcBorders>
+              <w:top w:val="single" w:sz="7" w:space="0" w:color="D9D9D9"/>
+              <w:left w:val="single" w:sz="7" w:space="0" w:color="D9D9D9"/>
+              <w:bottom w:val="single" w:sz="7" w:space="0" w:color="D9D9D9"/>
+              <w:right w:val="single" w:sz="7" w:space="0" w:color="D9D9D9"/>
+              <w:insideH w:val="single" w:sz="7" w:space="0" w:color="D9D9D9"/>
+              <w:insideV w:val="single" w:sz="7" w:space="0" w:color="D9D9D9"/>
+            </w:tcBorders>
+            <w:tcMar>
+              <w:top w:w="90" w:type="dxa"/>
+              <w:start w:w="110" w:type="dxa"/>
+              <w:bottom w:w="90" w:type="dxa"/>
+              <w:end w:w="110" w:type="dxa"/>
+            </w:tcMar>
+            <w:vAlign w:val="center"/>
+            <w:shd w:fill="F8FAFC"/>
+          </w:tcPr>
+          <w:p>
+            <w:pPr>
+              <w:keepNext w:val="0"/>
+              <w:spacing w:before="0" w:after="0" w:line="252" w:lineRule="auto"/>
+              <w:jc w:val="center"/>
+            </w:pPr>
+            <w:r>
+              <w:rPr>
+                <w:rFonts w:ascii="Aptos" w:hAnsi="Aptos" w:eastAsia="Aptos"/>
+                <w:b/>
+                <w:i w:val="0"/>
+                <w:color w:val="1F4E78"/>
+                <w:sz w:val="18"/>
+              </w:rPr>
+              <w:t>12</w:t>
+            </w:r>
+          </w:p>
+        </w:tc>
+        <w:tc>
+          <w:tcPr>
+            <w:tcW w:type="dxa" w:w="8731"/>
+            <w:tcBorders>
+              <w:top w:val="single" w:sz="7" w:space="0" w:color="D9D9D9"/>
+              <w:left w:val="single" w:sz="7" w:space="0" w:color="D9D9D9"/>
+              <w:bottom w:val="single" w:sz="7" w:space="0" w:color="D9D9D9"/>
+              <w:right w:val="single" w:sz="7" w:space="0" w:color="D9D9D9"/>
+              <w:insideH w:val="single" w:sz="7" w:space="0" w:color="D9D9D9"/>
+              <w:insideV w:val="single" w:sz="7" w:space="0" w:color="D9D9D9"/>
+            </w:tcBorders>
+            <w:tcMar>
+              <w:top w:w="90" w:type="dxa"/>
+              <w:start w:w="110" w:type="dxa"/>
+              <w:bottom w:w="90" w:type="dxa"/>
+              <w:end w:w="110" w:type="dxa"/>
+            </w:tcMar>
+            <w:vAlign w:val="center"/>
+            <w:shd w:fill="F8FAFC"/>
+          </w:tcPr>
+          <w:p>
+            <w:pPr>
+              <w:keepNext w:val="0"/>
+              <w:spacing w:before="0" w:after="0" w:line="240" w:lineRule="auto"/>
+            </w:pPr>
+            <w:r>
+              <w:rPr>
+                <w:rFonts w:ascii="Aptos" w:hAnsi="Aptos" w:eastAsia="Aptos"/>
+                <w:b w:val="0"/>
+                <w:i w:val="0"/>
+                <w:color w:val="1F2937"/>
+                <w:sz w:val="18"/>
+              </w:rPr>
+              <w:t>Wyjaśnienie zawiera przyczynę (ciężki ptak, szybowanie, brak prądów nad morzem) i skutek (droga nad lądem). Uczeń pisze własnymi słowami.</w:t>
+            </w:r>
+          </w:p>
+        </w:tc>
+      </w:tr>
+    </w:tbl>
+    <w:p>
+      <w:pPr>
+        <w:pStyle w:val="Heading2"/>
+      </w:pPr>
+      <w:r>
+        <w:rPr>
+          <w:rFonts w:ascii="Aptos" w:hAnsi="Aptos" w:eastAsia="Aptos"/>
+          <w:b/>
+          <w:i w:val="0"/>
+          <w:color w:val="000000"/>
+          <w:sz w:val="23"/>
+        </w:rPr>
+        <w:t>Szybkie omówienie po pracy</w:t>
+      </w:r>
+    </w:p>
+    <w:p>
+      <w:pPr>
+        <w:keepNext w:val="0"/>
+        <w:spacing w:before="0" w:after="0" w:line="252" w:lineRule="auto"/>
+      </w:pPr>
+      <w:r>
+        <w:rPr>
+          <w:rFonts w:ascii="Aptos" w:hAnsi="Aptos" w:eastAsia="Aptos"/>
+          <w:b w:val="0"/>
+          <w:i w:val="0"/>
+          <w:color w:val="1F2937"/>
+          <w:sz w:val="19"/>
+        </w:rPr>
+        <w:t>Poproś uczniów, aby wskazali fragment tekstu potwierdzający odpowiedź, poprawili jedno zadanie i nazwali strategię, która im pomogła.</w:t>
+      </w:r>
+    </w:p>
+    <w:p>
+      <w:r>
+        <w:br w:type="page"/>
+      </w:r>
+    </w:p>
+    <w:p>
+      <w:pPr>
+        <w:pStyle w:val="Heading1"/>
+      </w:pPr>
+      <w:r>
+        <w:rPr>
+          <w:rFonts w:ascii="Aptos" w:hAnsi="Aptos" w:eastAsia="Aptos"/>
+          <w:b/>
+          <w:i w:val="0"/>
+          <w:color w:val="000000"/>
+          <w:sz w:val="26"/>
+        </w:rPr>
+        <w:t>Arkusz 7  Ktoś nowy w domu</w:t>
+      </w:r>
+    </w:p>
+    <w:tbl>
+      <w:tblPr>
+        <w:tblW w:type="auto" w:w="0"/>
+        <w:jc w:val="center"/>
+        <w:tblLayout w:type="fixed"/>
+        <w:tblLook w:firstColumn="1" w:firstRow="1" w:lastColumn="0" w:lastRow="0" w:noHBand="0" w:noVBand="1" w:val="04A0"/>
+      </w:tblPr>
+      <w:tblGrid>
+        <w:gridCol w:w="964"/>
+        <w:gridCol w:w="8731"/>
+      </w:tblGrid>
+      <w:tr>
+        <w:trPr>
+          <w:tblHeader w:val="true"/>
+        </w:trPr>
+        <w:tc>
+          <w:tcPr>
+            <w:tcW w:type="dxa" w:w="964"/>
+            <w:shd w:fill="1F4E78"/>
+            <w:tcBorders>
+              <w:top w:val="single" w:sz="7" w:space="0" w:color="D9D9D9"/>
+              <w:left w:val="single" w:sz="7" w:space="0" w:color="D9D9D9"/>
+              <w:bottom w:val="single" w:sz="7" w:space="0" w:color="D9D9D9"/>
+              <w:right w:val="single" w:sz="7" w:space="0" w:color="D9D9D9"/>
+              <w:insideH w:val="single" w:sz="7" w:space="0" w:color="D9D9D9"/>
+              <w:insideV w:val="single" w:sz="7" w:space="0" w:color="D9D9D9"/>
+            </w:tcBorders>
+            <w:tcMar>
+              <w:top w:w="105" w:type="dxa"/>
+              <w:start w:w="110" w:type="dxa"/>
+              <w:bottom w:w="105" w:type="dxa"/>
+              <w:end w:w="110" w:type="dxa"/>
+            </w:tcMar>
+          </w:tcPr>
+          <w:p>
+            <w:pPr>
+              <w:keepNext w:val="0"/>
+              <w:spacing w:before="0" w:after="0" w:line="252" w:lineRule="auto"/>
+              <w:jc w:val="center"/>
+            </w:pPr>
+            <w:r>
+              <w:rPr>
+                <w:rFonts w:ascii="Aptos" w:hAnsi="Aptos" w:eastAsia="Aptos"/>
+                <w:b/>
+                <w:i w:val="0"/>
+                <w:color w:val="FFFFFF"/>
+                <w:sz w:val="19"/>
+              </w:rPr>
+              <w:t>Zadanie</w:t>
+            </w:r>
+          </w:p>
+        </w:tc>
+        <w:tc>
+          <w:tcPr>
+            <w:tcW w:type="dxa" w:w="8731"/>
+            <w:shd w:fill="1F4E78"/>
+            <w:tcBorders>
+              <w:top w:val="single" w:sz="7" w:space="0" w:color="D9D9D9"/>
+              <w:left w:val="single" w:sz="7" w:space="0" w:color="D9D9D9"/>
+              <w:bottom w:val="single" w:sz="7" w:space="0" w:color="D9D9D9"/>
+              <w:right w:val="single" w:sz="7" w:space="0" w:color="D9D9D9"/>
+              <w:insideH w:val="single" w:sz="7" w:space="0" w:color="D9D9D9"/>
+              <w:insideV w:val="single" w:sz="7" w:space="0" w:color="D9D9D9"/>
+            </w:tcBorders>
+            <w:tcMar>
+              <w:top w:w="105" w:type="dxa"/>
+              <w:start w:w="110" w:type="dxa"/>
+              <w:bottom w:w="105" w:type="dxa"/>
+              <w:end w:w="110" w:type="dxa"/>
+            </w:tcMar>
+          </w:tcPr>
+          <w:p>
+            <w:pPr>
+              <w:keepNext w:val="0"/>
+              <w:spacing w:before="0" w:after="0" w:line="252" w:lineRule="auto"/>
+              <w:jc w:val="center"/>
+            </w:pPr>
+            <w:r>
+              <w:rPr>
+                <w:rFonts w:ascii="Aptos" w:hAnsi="Aptos" w:eastAsia="Aptos"/>
+                <w:b/>
+                <w:i w:val="0"/>
+                <w:color w:val="FFFFFF"/>
+                <w:sz w:val="19"/>
+              </w:rPr>
+              <w:t>Odpowiedź lub kryterium</w:t>
+            </w:r>
+          </w:p>
+        </w:tc>
+      </w:tr>
+      <w:tr>
+        <w:tc>
+          <w:tcPr>
+            <w:tcW w:type="dxa" w:w="964"/>
+            <w:tcBorders>
+              <w:top w:val="single" w:sz="7" w:space="0" w:color="D9D9D9"/>
+              <w:left w:val="single" w:sz="7" w:space="0" w:color="D9D9D9"/>
+              <w:bottom w:val="single" w:sz="7" w:space="0" w:color="D9D9D9"/>
+              <w:right w:val="single" w:sz="7" w:space="0" w:color="D9D9D9"/>
+              <w:insideH w:val="single" w:sz="7" w:space="0" w:color="D9D9D9"/>
+              <w:insideV w:val="single" w:sz="7" w:space="0" w:color="D9D9D9"/>
+            </w:tcBorders>
+            <w:tcMar>
+              <w:top w:w="90" w:type="dxa"/>
+              <w:start w:w="110" w:type="dxa"/>
+              <w:bottom w:w="90" w:type="dxa"/>
+              <w:end w:w="110" w:type="dxa"/>
+            </w:tcMar>
+            <w:vAlign w:val="center"/>
+          </w:tcPr>
+          <w:p>
+            <w:pPr>
+              <w:keepNext w:val="0"/>
+              <w:spacing w:before="0" w:after="0" w:line="252" w:lineRule="auto"/>
+              <w:jc w:val="center"/>
+            </w:pPr>
+            <w:r>
+              <w:rPr>
+                <w:rFonts w:ascii="Aptos" w:hAnsi="Aptos" w:eastAsia="Aptos"/>
+                <w:b/>
+                <w:i w:val="0"/>
+                <w:color w:val="1F4E78"/>
+                <w:sz w:val="18"/>
+              </w:rPr>
+              <w:t>1</w:t>
+            </w:r>
+          </w:p>
+        </w:tc>
+        <w:tc>
+          <w:tcPr>
+            <w:tcW w:type="dxa" w:w="8731"/>
+            <w:tcBorders>
+              <w:top w:val="single" w:sz="7" w:space="0" w:color="D9D9D9"/>
+              <w:left w:val="single" w:sz="7" w:space="0" w:color="D9D9D9"/>
+              <w:bottom w:val="single" w:sz="7" w:space="0" w:color="D9D9D9"/>
+              <w:right w:val="single" w:sz="7" w:space="0" w:color="D9D9D9"/>
+              <w:insideH w:val="single" w:sz="7" w:space="0" w:color="D9D9D9"/>
+              <w:insideV w:val="single" w:sz="7" w:space="0" w:color="D9D9D9"/>
+            </w:tcBorders>
+            <w:tcMar>
+              <w:top w:w="90" w:type="dxa"/>
+              <w:start w:w="110" w:type="dxa"/>
+              <w:bottom w:w="90" w:type="dxa"/>
+              <w:end w:w="110" w:type="dxa"/>
+            </w:tcMar>
+            <w:vAlign w:val="center"/>
+          </w:tcPr>
+          <w:p>
+            <w:pPr>
+              <w:keepNext w:val="0"/>
+              <w:spacing w:before="0" w:after="0" w:line="240" w:lineRule="auto"/>
+            </w:pPr>
+            <w:r>
+              <w:rPr>
+                <w:rFonts w:ascii="Aptos" w:hAnsi="Aptos" w:eastAsia="Aptos"/>
+                <w:b w:val="0"/>
+                <w:i w:val="0"/>
+                <w:color w:val="1F2937"/>
+                <w:sz w:val="18"/>
+              </w:rPr>
+              <w:t>Pies. Dowody, np.: trzyma piłkę w zębach, chodzi na spacery, obwąchuje krzaki, ma miskę, pan złapał go za ucho, je skarpetkę.</w:t>
+            </w:r>
+          </w:p>
+        </w:tc>
+      </w:tr>
+      <w:tr>
+        <w:tc>
+          <w:tcPr>
+            <w:tcW w:type="dxa" w:w="964"/>
+            <w:tcBorders>
+              <w:top w:val="single" w:sz="7" w:space="0" w:color="D9D9D9"/>
+              <w:left w:val="single" w:sz="7" w:space="0" w:color="D9D9D9"/>
+              <w:bottom w:val="single" w:sz="7" w:space="0" w:color="D9D9D9"/>
+              <w:right w:val="single" w:sz="7" w:space="0" w:color="D9D9D9"/>
+              <w:insideH w:val="single" w:sz="7" w:space="0" w:color="D9D9D9"/>
+              <w:insideV w:val="single" w:sz="7" w:space="0" w:color="D9D9D9"/>
+            </w:tcBorders>
+            <w:tcMar>
+              <w:top w:w="90" w:type="dxa"/>
+              <w:start w:w="110" w:type="dxa"/>
+              <w:bottom w:w="90" w:type="dxa"/>
+              <w:end w:w="110" w:type="dxa"/>
+            </w:tcMar>
+            <w:vAlign w:val="center"/>
+            <w:shd w:fill="F8FAFC"/>
+          </w:tcPr>
+          <w:p>
+            <w:pPr>
+              <w:keepNext w:val="0"/>
+              <w:spacing w:before="0" w:after="0" w:line="252" w:lineRule="auto"/>
+              <w:jc w:val="center"/>
+            </w:pPr>
+            <w:r>
+              <w:rPr>
+                <w:rFonts w:ascii="Aptos" w:hAnsi="Aptos" w:eastAsia="Aptos"/>
+                <w:b/>
+                <w:i w:val="0"/>
+                <w:color w:val="1F4E78"/>
+                <w:sz w:val="18"/>
+              </w:rPr>
+              <w:t>2</w:t>
+            </w:r>
+          </w:p>
+        </w:tc>
+        <w:tc>
+          <w:tcPr>
+            <w:tcW w:type="dxa" w:w="8731"/>
+            <w:tcBorders>
+              <w:top w:val="single" w:sz="7" w:space="0" w:color="D9D9D9"/>
+              <w:left w:val="single" w:sz="7" w:space="0" w:color="D9D9D9"/>
+              <w:bottom w:val="single" w:sz="7" w:space="0" w:color="D9D9D9"/>
+              <w:right w:val="single" w:sz="7" w:space="0" w:color="D9D9D9"/>
+              <w:insideH w:val="single" w:sz="7" w:space="0" w:color="D9D9D9"/>
+              <w:insideV w:val="single" w:sz="7" w:space="0" w:color="D9D9D9"/>
+            </w:tcBorders>
+            <w:tcMar>
+              <w:top w:w="90" w:type="dxa"/>
+              <w:start w:w="110" w:type="dxa"/>
+              <w:bottom w:w="90" w:type="dxa"/>
+              <w:end w:w="110" w:type="dxa"/>
+            </w:tcMar>
+            <w:vAlign w:val="center"/>
+            <w:shd w:fill="F8FAFC"/>
+          </w:tcPr>
+          <w:p>
+            <w:pPr>
+              <w:keepNext w:val="0"/>
+              <w:spacing w:before="0" w:after="0" w:line="240" w:lineRule="auto"/>
+            </w:pPr>
+            <w:r>
+              <w:rPr>
+                <w:rFonts w:ascii="Aptos" w:hAnsi="Aptos" w:eastAsia="Aptos"/>
+                <w:b w:val="0"/>
+                <w:i w:val="0"/>
+                <w:color w:val="1F2937"/>
+                <w:sz w:val="18"/>
+              </w:rPr>
+              <w:t>Niemowlę, nowe dziecko w rodzinie: jest małe, płacze, pachnie mlekiem, leży na kocu, pierwszy raz się śmieje.</w:t>
+            </w:r>
+          </w:p>
+        </w:tc>
+      </w:tr>
+      <w:tr>
+        <w:tc>
+          <w:tcPr>
+            <w:tcW w:type="dxa" w:w="964"/>
+            <w:tcBorders>
+              <w:top w:val="single" w:sz="7" w:space="0" w:color="D9D9D9"/>
+              <w:left w:val="single" w:sz="7" w:space="0" w:color="D9D9D9"/>
+              <w:bottom w:val="single" w:sz="7" w:space="0" w:color="D9D9D9"/>
+              <w:right w:val="single" w:sz="7" w:space="0" w:color="D9D9D9"/>
+              <w:insideH w:val="single" w:sz="7" w:space="0" w:color="D9D9D9"/>
+              <w:insideV w:val="single" w:sz="7" w:space="0" w:color="D9D9D9"/>
+            </w:tcBorders>
+            <w:tcMar>
+              <w:top w:w="90" w:type="dxa"/>
+              <w:start w:w="110" w:type="dxa"/>
+              <w:bottom w:w="90" w:type="dxa"/>
+              <w:end w:w="110" w:type="dxa"/>
+            </w:tcMar>
+            <w:vAlign w:val="center"/>
+          </w:tcPr>
+          <w:p>
+            <w:pPr>
+              <w:keepNext w:val="0"/>
+              <w:spacing w:before="0" w:after="0" w:line="252" w:lineRule="auto"/>
+              <w:jc w:val="center"/>
+            </w:pPr>
+            <w:r>
+              <w:rPr>
+                <w:rFonts w:ascii="Aptos" w:hAnsi="Aptos" w:eastAsia="Aptos"/>
+                <w:b/>
+                <w:i w:val="0"/>
+                <w:color w:val="1F4E78"/>
+                <w:sz w:val="18"/>
+              </w:rPr>
+              <w:t>3</w:t>
+            </w:r>
+          </w:p>
+        </w:tc>
+        <w:tc>
+          <w:tcPr>
+            <w:tcW w:type="dxa" w:w="8731"/>
+            <w:tcBorders>
+              <w:top w:val="single" w:sz="7" w:space="0" w:color="D9D9D9"/>
+              <w:left w:val="single" w:sz="7" w:space="0" w:color="D9D9D9"/>
+              <w:bottom w:val="single" w:sz="7" w:space="0" w:color="D9D9D9"/>
+              <w:right w:val="single" w:sz="7" w:space="0" w:color="D9D9D9"/>
+              <w:insideH w:val="single" w:sz="7" w:space="0" w:color="D9D9D9"/>
+              <w:insideV w:val="single" w:sz="7" w:space="0" w:color="D9D9D9"/>
+            </w:tcBorders>
+            <w:tcMar>
+              <w:top w:w="90" w:type="dxa"/>
+              <w:start w:w="110" w:type="dxa"/>
+              <w:bottom w:w="90" w:type="dxa"/>
+              <w:end w:w="110" w:type="dxa"/>
+            </w:tcMar>
+            <w:vAlign w:val="center"/>
+          </w:tcPr>
+          <w:p>
+            <w:pPr>
+              <w:keepNext w:val="0"/>
+              <w:spacing w:before="0" w:after="0" w:line="240" w:lineRule="auto"/>
+            </w:pPr>
+            <w:r>
+              <w:rPr>
+                <w:rFonts w:ascii="Aptos" w:hAnsi="Aptos" w:eastAsia="Aptos"/>
+                <w:b w:val="0"/>
+                <w:i w:val="0"/>
+                <w:color w:val="1F2937"/>
+                <w:sz w:val="18"/>
+              </w:rPr>
+              <w:t>Był zły albo zazdrosny, bo wszyscy zajmowali się dzieckiem, a spacery były krótsze. Pani odgadła częściowo - nazwała to samotnością.</w:t>
+            </w:r>
+          </w:p>
+        </w:tc>
+      </w:tr>
+      <w:tr>
+        <w:tc>
+          <w:tcPr>
+            <w:tcW w:type="dxa" w:w="964"/>
+            <w:tcBorders>
+              <w:top w:val="single" w:sz="7" w:space="0" w:color="D9D9D9"/>
+              <w:left w:val="single" w:sz="7" w:space="0" w:color="D9D9D9"/>
+              <w:bottom w:val="single" w:sz="7" w:space="0" w:color="D9D9D9"/>
+              <w:right w:val="single" w:sz="7" w:space="0" w:color="D9D9D9"/>
+              <w:insideH w:val="single" w:sz="7" w:space="0" w:color="D9D9D9"/>
+              <w:insideV w:val="single" w:sz="7" w:space="0" w:color="D9D9D9"/>
+            </w:tcBorders>
+            <w:tcMar>
+              <w:top w:w="90" w:type="dxa"/>
+              <w:start w:w="110" w:type="dxa"/>
+              <w:bottom w:w="90" w:type="dxa"/>
+              <w:end w:w="110" w:type="dxa"/>
+            </w:tcMar>
+            <w:vAlign w:val="center"/>
+            <w:shd w:fill="F8FAFC"/>
+          </w:tcPr>
+          <w:p>
+            <w:pPr>
+              <w:keepNext w:val="0"/>
+              <w:spacing w:before="0" w:after="0" w:line="252" w:lineRule="auto"/>
+              <w:jc w:val="center"/>
+            </w:pPr>
+            <w:r>
+              <w:rPr>
+                <w:rFonts w:ascii="Aptos" w:hAnsi="Aptos" w:eastAsia="Aptos"/>
+                <w:b/>
+                <w:i w:val="0"/>
+                <w:color w:val="1F4E78"/>
+                <w:sz w:val="18"/>
+              </w:rPr>
+              <w:t>4</w:t>
+            </w:r>
+          </w:p>
+        </w:tc>
+        <w:tc>
+          <w:tcPr>
+            <w:tcW w:type="dxa" w:w="8731"/>
+            <w:tcBorders>
+              <w:top w:val="single" w:sz="7" w:space="0" w:color="D9D9D9"/>
+              <w:left w:val="single" w:sz="7" w:space="0" w:color="D9D9D9"/>
+              <w:bottom w:val="single" w:sz="7" w:space="0" w:color="D9D9D9"/>
+              <w:right w:val="single" w:sz="7" w:space="0" w:color="D9D9D9"/>
+              <w:insideH w:val="single" w:sz="7" w:space="0" w:color="D9D9D9"/>
+              <w:insideV w:val="single" w:sz="7" w:space="0" w:color="D9D9D9"/>
+            </w:tcBorders>
+            <w:tcMar>
+              <w:top w:w="90" w:type="dxa"/>
+              <w:start w:w="110" w:type="dxa"/>
+              <w:bottom w:w="90" w:type="dxa"/>
+              <w:end w:w="110" w:type="dxa"/>
+            </w:tcMar>
+            <w:vAlign w:val="center"/>
+            <w:shd w:fill="F8FAFC"/>
+          </w:tcPr>
+          <w:p>
+            <w:pPr>
+              <w:keepNext w:val="0"/>
+              <w:spacing w:before="0" w:after="0" w:line="240" w:lineRule="auto"/>
+            </w:pPr>
+            <w:r>
+              <w:rPr>
+                <w:rFonts w:ascii="Aptos" w:hAnsi="Aptos" w:eastAsia="Aptos"/>
+                <w:b w:val="0"/>
+                <w:i w:val="0"/>
+                <w:color w:val="1F2937"/>
+                <w:sz w:val="18"/>
+              </w:rPr>
+              <w:t>F (od trzech miesięcy), F, ?</w:t>
+            </w:r>
+          </w:p>
+        </w:tc>
+      </w:tr>
+      <w:tr>
+        <w:tc>
+          <w:tcPr>
+            <w:tcW w:type="dxa" w:w="964"/>
+            <w:tcBorders>
+              <w:top w:val="single" w:sz="7" w:space="0" w:color="D9D9D9"/>
+              <w:left w:val="single" w:sz="7" w:space="0" w:color="D9D9D9"/>
+              <w:bottom w:val="single" w:sz="7" w:space="0" w:color="D9D9D9"/>
+              <w:right w:val="single" w:sz="7" w:space="0" w:color="D9D9D9"/>
+              <w:insideH w:val="single" w:sz="7" w:space="0" w:color="D9D9D9"/>
+              <w:insideV w:val="single" w:sz="7" w:space="0" w:color="D9D9D9"/>
+            </w:tcBorders>
+            <w:tcMar>
+              <w:top w:w="90" w:type="dxa"/>
+              <w:start w:w="110" w:type="dxa"/>
+              <w:bottom w:w="90" w:type="dxa"/>
+              <w:end w:w="110" w:type="dxa"/>
+            </w:tcMar>
+            <w:vAlign w:val="center"/>
+          </w:tcPr>
+          <w:p>
+            <w:pPr>
+              <w:keepNext w:val="0"/>
+              <w:spacing w:before="0" w:after="0" w:line="252" w:lineRule="auto"/>
+              <w:jc w:val="center"/>
+            </w:pPr>
+            <w:r>
+              <w:rPr>
+                <w:rFonts w:ascii="Aptos" w:hAnsi="Aptos" w:eastAsia="Aptos"/>
+                <w:b/>
+                <w:i w:val="0"/>
+                <w:color w:val="1F4E78"/>
+                <w:sz w:val="18"/>
+              </w:rPr>
+              <w:t>5</w:t>
+            </w:r>
+          </w:p>
+        </w:tc>
+        <w:tc>
+          <w:tcPr>
+            <w:tcW w:type="dxa" w:w="8731"/>
+            <w:tcBorders>
+              <w:top w:val="single" w:sz="7" w:space="0" w:color="D9D9D9"/>
+              <w:left w:val="single" w:sz="7" w:space="0" w:color="D9D9D9"/>
+              <w:bottom w:val="single" w:sz="7" w:space="0" w:color="D9D9D9"/>
+              <w:right w:val="single" w:sz="7" w:space="0" w:color="D9D9D9"/>
+              <w:insideH w:val="single" w:sz="7" w:space="0" w:color="D9D9D9"/>
+              <w:insideV w:val="single" w:sz="7" w:space="0" w:color="D9D9D9"/>
+            </w:tcBorders>
+            <w:tcMar>
+              <w:top w:w="90" w:type="dxa"/>
+              <w:start w:w="110" w:type="dxa"/>
+              <w:bottom w:w="90" w:type="dxa"/>
+              <w:end w:w="110" w:type="dxa"/>
+            </w:tcMar>
+            <w:vAlign w:val="center"/>
+          </w:tcPr>
+          <w:p>
+            <w:pPr>
+              <w:keepNext w:val="0"/>
+              <w:spacing w:before="0" w:after="0" w:line="240" w:lineRule="auto"/>
+            </w:pPr>
+            <w:r>
+              <w:rPr>
+                <w:rFonts w:ascii="Aptos" w:hAnsi="Aptos" w:eastAsia="Aptos"/>
+                <w:b w:val="0"/>
+                <w:i w:val="0"/>
+                <w:color w:val="1F2937"/>
+                <w:sz w:val="18"/>
+              </w:rPr>
+              <w:t>Pierwszy śmiech dziecka sprawił rodzicom ogromną radość - to był dla nich prezent, choć nikt niczego nie dał.</w:t>
+            </w:r>
+          </w:p>
+        </w:tc>
+      </w:tr>
+      <w:tr>
+        <w:tc>
+          <w:tcPr>
+            <w:tcW w:type="dxa" w:w="964"/>
+            <w:tcBorders>
+              <w:top w:val="single" w:sz="7" w:space="0" w:color="D9D9D9"/>
+              <w:left w:val="single" w:sz="7" w:space="0" w:color="D9D9D9"/>
+              <w:bottom w:val="single" w:sz="7" w:space="0" w:color="D9D9D9"/>
+              <w:right w:val="single" w:sz="7" w:space="0" w:color="D9D9D9"/>
+              <w:insideH w:val="single" w:sz="7" w:space="0" w:color="D9D9D9"/>
+              <w:insideV w:val="single" w:sz="7" w:space="0" w:color="D9D9D9"/>
+            </w:tcBorders>
+            <w:tcMar>
+              <w:top w:w="90" w:type="dxa"/>
+              <w:start w:w="110" w:type="dxa"/>
+              <w:bottom w:w="90" w:type="dxa"/>
+              <w:end w:w="110" w:type="dxa"/>
+            </w:tcMar>
+            <w:vAlign w:val="center"/>
+            <w:shd w:fill="F8FAFC"/>
+          </w:tcPr>
+          <w:p>
+            <w:pPr>
+              <w:keepNext w:val="0"/>
+              <w:spacing w:before="0" w:after="0" w:line="252" w:lineRule="auto"/>
+              <w:jc w:val="center"/>
+            </w:pPr>
+            <w:r>
+              <w:rPr>
+                <w:rFonts w:ascii="Aptos" w:hAnsi="Aptos" w:eastAsia="Aptos"/>
+                <w:b/>
+                <w:i w:val="0"/>
+                <w:color w:val="1F4E78"/>
+                <w:sz w:val="18"/>
+              </w:rPr>
+              <w:t>6</w:t>
+            </w:r>
+          </w:p>
+        </w:tc>
+        <w:tc>
+          <w:tcPr>
+            <w:tcW w:type="dxa" w:w="8731"/>
+            <w:tcBorders>
+              <w:top w:val="single" w:sz="7" w:space="0" w:color="D9D9D9"/>
+              <w:left w:val="single" w:sz="7" w:space="0" w:color="D9D9D9"/>
+              <w:bottom w:val="single" w:sz="7" w:space="0" w:color="D9D9D9"/>
+              <w:right w:val="single" w:sz="7" w:space="0" w:color="D9D9D9"/>
+              <w:insideH w:val="single" w:sz="7" w:space="0" w:color="D9D9D9"/>
+              <w:insideV w:val="single" w:sz="7" w:space="0" w:color="D9D9D9"/>
+            </w:tcBorders>
+            <w:tcMar>
+              <w:top w:w="90" w:type="dxa"/>
+              <w:start w:w="110" w:type="dxa"/>
+              <w:bottom w:w="90" w:type="dxa"/>
+              <w:end w:w="110" w:type="dxa"/>
+            </w:tcMar>
+            <w:vAlign w:val="center"/>
+            <w:shd w:fill="F8FAFC"/>
+          </w:tcPr>
+          <w:p>
+            <w:pPr>
+              <w:keepNext w:val="0"/>
+              <w:spacing w:before="0" w:after="0" w:line="240" w:lineRule="auto"/>
+            </w:pPr>
+            <w:r>
+              <w:rPr>
+                <w:rFonts w:ascii="Aptos" w:hAnsi="Aptos" w:eastAsia="Aptos"/>
+                <w:b w:val="0"/>
+                <w:i w:val="0"/>
+                <w:color w:val="1F2937"/>
+                <w:sz w:val="18"/>
+              </w:rPr>
+              <w:t>Na początku pies jest zazdrosny i czuje się odsunięty, na końcu polubił dziecko i chce się nim opiekować jak starszy brat.</w:t>
+            </w:r>
+          </w:p>
+        </w:tc>
+      </w:tr>
+      <w:tr>
+        <w:tc>
+          <w:tcPr>
+            <w:tcW w:type="dxa" w:w="964"/>
+            <w:tcBorders>
+              <w:top w:val="single" w:sz="7" w:space="0" w:color="D9D9D9"/>
+              <w:left w:val="single" w:sz="7" w:space="0" w:color="D9D9D9"/>
+              <w:bottom w:val="single" w:sz="7" w:space="0" w:color="D9D9D9"/>
+              <w:right w:val="single" w:sz="7" w:space="0" w:color="D9D9D9"/>
+              <w:insideH w:val="single" w:sz="7" w:space="0" w:color="D9D9D9"/>
+              <w:insideV w:val="single" w:sz="7" w:space="0" w:color="D9D9D9"/>
+            </w:tcBorders>
+            <w:tcMar>
+              <w:top w:w="90" w:type="dxa"/>
+              <w:start w:w="110" w:type="dxa"/>
+              <w:bottom w:w="90" w:type="dxa"/>
+              <w:end w:w="110" w:type="dxa"/>
+            </w:tcMar>
+            <w:vAlign w:val="center"/>
+          </w:tcPr>
+          <w:p>
+            <w:pPr>
+              <w:keepNext w:val="0"/>
+              <w:spacing w:before="0" w:after="0" w:line="252" w:lineRule="auto"/>
+              <w:jc w:val="center"/>
+            </w:pPr>
+            <w:r>
+              <w:rPr>
+                <w:rFonts w:ascii="Aptos" w:hAnsi="Aptos" w:eastAsia="Aptos"/>
+                <w:b/>
+                <w:i w:val="0"/>
+                <w:color w:val="1F4E78"/>
+                <w:sz w:val="18"/>
+              </w:rPr>
+              <w:t>7</w:t>
+            </w:r>
+          </w:p>
+        </w:tc>
+        <w:tc>
+          <w:tcPr>
+            <w:tcW w:type="dxa" w:w="8731"/>
+            <w:tcBorders>
+              <w:top w:val="single" w:sz="7" w:space="0" w:color="D9D9D9"/>
+              <w:left w:val="single" w:sz="7" w:space="0" w:color="D9D9D9"/>
+              <w:bottom w:val="single" w:sz="7" w:space="0" w:color="D9D9D9"/>
+              <w:right w:val="single" w:sz="7" w:space="0" w:color="D9D9D9"/>
+              <w:insideH w:val="single" w:sz="7" w:space="0" w:color="D9D9D9"/>
+              <w:insideV w:val="single" w:sz="7" w:space="0" w:color="D9D9D9"/>
+            </w:tcBorders>
+            <w:tcMar>
+              <w:top w:w="90" w:type="dxa"/>
+              <w:start w:w="110" w:type="dxa"/>
+              <w:bottom w:w="90" w:type="dxa"/>
+              <w:end w:w="110" w:type="dxa"/>
+            </w:tcMar>
+            <w:vAlign w:val="center"/>
+          </w:tcPr>
+          <w:p>
+            <w:pPr>
+              <w:keepNext w:val="0"/>
+              <w:spacing w:before="0" w:after="0" w:line="240" w:lineRule="auto"/>
+            </w:pPr>
+            <w:r>
+              <w:rPr>
+                <w:rFonts w:ascii="Aptos" w:hAnsi="Aptos" w:eastAsia="Aptos"/>
+                <w:b w:val="0"/>
+                <w:i w:val="0"/>
+                <w:color w:val="1F2937"/>
+                <w:sz w:val="18"/>
+              </w:rPr>
+              <w:t>Wcześniej to on był najważniejszy. Wczoraj zjadł skarpetkę.</w:t>
+            </w:r>
+          </w:p>
+        </w:tc>
+      </w:tr>
+      <w:tr>
+        <w:tc>
+          <w:tcPr>
+            <w:tcW w:type="dxa" w:w="964"/>
+            <w:tcBorders>
+              <w:top w:val="single" w:sz="7" w:space="0" w:color="D9D9D9"/>
+              <w:left w:val="single" w:sz="7" w:space="0" w:color="D9D9D9"/>
+              <w:bottom w:val="single" w:sz="7" w:space="0" w:color="D9D9D9"/>
+              <w:right w:val="single" w:sz="7" w:space="0" w:color="D9D9D9"/>
+              <w:insideH w:val="single" w:sz="7" w:space="0" w:color="D9D9D9"/>
+              <w:insideV w:val="single" w:sz="7" w:space="0" w:color="D9D9D9"/>
+            </w:tcBorders>
+            <w:tcMar>
+              <w:top w:w="90" w:type="dxa"/>
+              <w:start w:w="110" w:type="dxa"/>
+              <w:bottom w:w="90" w:type="dxa"/>
+              <w:end w:w="110" w:type="dxa"/>
+            </w:tcMar>
+            <w:vAlign w:val="center"/>
+            <w:shd w:fill="F8FAFC"/>
+          </w:tcPr>
+          <w:p>
+            <w:pPr>
+              <w:keepNext w:val="0"/>
+              <w:spacing w:before="0" w:after="0" w:line="252" w:lineRule="auto"/>
+              <w:jc w:val="center"/>
+            </w:pPr>
+            <w:r>
+              <w:rPr>
+                <w:rFonts w:ascii="Aptos" w:hAnsi="Aptos" w:eastAsia="Aptos"/>
+                <w:b/>
+                <w:i w:val="0"/>
+                <w:color w:val="1F4E78"/>
+                <w:sz w:val="18"/>
+              </w:rPr>
+              <w:t>8</w:t>
+            </w:r>
+          </w:p>
+        </w:tc>
+        <w:tc>
+          <w:tcPr>
+            <w:tcW w:type="dxa" w:w="8731"/>
+            <w:tcBorders>
+              <w:top w:val="single" w:sz="7" w:space="0" w:color="D9D9D9"/>
+              <w:left w:val="single" w:sz="7" w:space="0" w:color="D9D9D9"/>
+              <w:bottom w:val="single" w:sz="7" w:space="0" w:color="D9D9D9"/>
+              <w:right w:val="single" w:sz="7" w:space="0" w:color="D9D9D9"/>
+              <w:insideH w:val="single" w:sz="7" w:space="0" w:color="D9D9D9"/>
+              <w:insideV w:val="single" w:sz="7" w:space="0" w:color="D9D9D9"/>
+            </w:tcBorders>
+            <w:tcMar>
+              <w:top w:w="90" w:type="dxa"/>
+              <w:start w:w="110" w:type="dxa"/>
+              <w:bottom w:w="90" w:type="dxa"/>
+              <w:end w:w="110" w:type="dxa"/>
+            </w:tcMar>
+            <w:vAlign w:val="center"/>
+            <w:shd w:fill="F8FAFC"/>
+          </w:tcPr>
+          <w:p>
+            <w:pPr>
+              <w:keepNext w:val="0"/>
+              <w:spacing w:before="0" w:after="0" w:line="240" w:lineRule="auto"/>
+            </w:pPr>
+            <w:r>
+              <w:rPr>
+                <w:rFonts w:ascii="Aptos" w:hAnsi="Aptos" w:eastAsia="Aptos"/>
+                <w:b w:val="0"/>
+                <w:i w:val="0"/>
+                <w:color w:val="1F2937"/>
+                <w:sz w:val="18"/>
+              </w:rPr>
+              <w:t>biegną - 3. os., lm, czas teraźniejszy; zjadłem - 1. os., lp, czas przeszły; zostanę - 1. os., lp, czas przyszły</w:t>
+            </w:r>
+          </w:p>
+        </w:tc>
+      </w:tr>
+      <w:tr>
+        <w:tc>
+          <w:tcPr>
+            <w:tcW w:type="dxa" w:w="964"/>
+            <w:tcBorders>
+              <w:top w:val="single" w:sz="7" w:space="0" w:color="D9D9D9"/>
+              <w:left w:val="single" w:sz="7" w:space="0" w:color="D9D9D9"/>
+              <w:bottom w:val="single" w:sz="7" w:space="0" w:color="D9D9D9"/>
+              <w:right w:val="single" w:sz="7" w:space="0" w:color="D9D9D9"/>
+              <w:insideH w:val="single" w:sz="7" w:space="0" w:color="D9D9D9"/>
+              <w:insideV w:val="single" w:sz="7" w:space="0" w:color="D9D9D9"/>
+            </w:tcBorders>
+            <w:tcMar>
+              <w:top w:w="90" w:type="dxa"/>
+              <w:start w:w="110" w:type="dxa"/>
+              <w:bottom w:w="90" w:type="dxa"/>
+              <w:end w:w="110" w:type="dxa"/>
+            </w:tcMar>
+            <w:vAlign w:val="center"/>
+          </w:tcPr>
+          <w:p>
+            <w:pPr>
+              <w:keepNext w:val="0"/>
+              <w:spacing w:before="0" w:after="0" w:line="252" w:lineRule="auto"/>
+              <w:jc w:val="center"/>
+            </w:pPr>
+            <w:r>
+              <w:rPr>
+                <w:rFonts w:ascii="Aptos" w:hAnsi="Aptos" w:eastAsia="Aptos"/>
+                <w:b/>
+                <w:i w:val="0"/>
+                <w:color w:val="1F4E78"/>
+                <w:sz w:val="18"/>
+              </w:rPr>
+              <w:t>9</w:t>
+            </w:r>
+          </w:p>
+        </w:tc>
+        <w:tc>
+          <w:tcPr>
+            <w:tcW w:type="dxa" w:w="8731"/>
+            <w:tcBorders>
+              <w:top w:val="single" w:sz="7" w:space="0" w:color="D9D9D9"/>
+              <w:left w:val="single" w:sz="7" w:space="0" w:color="D9D9D9"/>
+              <w:bottom w:val="single" w:sz="7" w:space="0" w:color="D9D9D9"/>
+              <w:right w:val="single" w:sz="7" w:space="0" w:color="D9D9D9"/>
+              <w:insideH w:val="single" w:sz="7" w:space="0" w:color="D9D9D9"/>
+              <w:insideV w:val="single" w:sz="7" w:space="0" w:color="D9D9D9"/>
+            </w:tcBorders>
+            <w:tcMar>
+              <w:top w:w="90" w:type="dxa"/>
+              <w:start w:w="110" w:type="dxa"/>
+              <w:bottom w:w="90" w:type="dxa"/>
+              <w:end w:w="110" w:type="dxa"/>
+            </w:tcMar>
+            <w:vAlign w:val="center"/>
+          </w:tcPr>
+          <w:p>
+            <w:pPr>
+              <w:keepNext w:val="0"/>
+              <w:spacing w:before="0" w:after="0" w:line="240" w:lineRule="auto"/>
+            </w:pPr>
+            <w:r>
+              <w:rPr>
+                <w:rFonts w:ascii="Aptos" w:hAnsi="Aptos" w:eastAsia="Aptos"/>
+                <w:b w:val="0"/>
+                <w:i w:val="0"/>
+                <w:color w:val="1F2937"/>
+                <w:sz w:val="18"/>
+              </w:rPr>
+              <w:t>Pani znieruchomiała z wrażenia.</w:t>
+            </w:r>
+          </w:p>
+        </w:tc>
+      </w:tr>
+      <w:tr>
+        <w:tc>
+          <w:tcPr>
+            <w:tcW w:type="dxa" w:w="964"/>
+            <w:tcBorders>
+              <w:top w:val="single" w:sz="7" w:space="0" w:color="D9D9D9"/>
+              <w:left w:val="single" w:sz="7" w:space="0" w:color="D9D9D9"/>
+              <w:bottom w:val="single" w:sz="7" w:space="0" w:color="D9D9D9"/>
+              <w:right w:val="single" w:sz="7" w:space="0" w:color="D9D9D9"/>
+              <w:insideH w:val="single" w:sz="7" w:space="0" w:color="D9D9D9"/>
+              <w:insideV w:val="single" w:sz="7" w:space="0" w:color="D9D9D9"/>
+            </w:tcBorders>
+            <w:tcMar>
+              <w:top w:w="90" w:type="dxa"/>
+              <w:start w:w="110" w:type="dxa"/>
+              <w:bottom w:w="90" w:type="dxa"/>
+              <w:end w:w="110" w:type="dxa"/>
+            </w:tcMar>
+            <w:vAlign w:val="center"/>
+            <w:shd w:fill="F8FAFC"/>
+          </w:tcPr>
+          <w:p>
+            <w:pPr>
+              <w:keepNext w:val="0"/>
+              <w:spacing w:before="0" w:after="0" w:line="252" w:lineRule="auto"/>
+              <w:jc w:val="center"/>
+            </w:pPr>
+            <w:r>
+              <w:rPr>
+                <w:rFonts w:ascii="Aptos" w:hAnsi="Aptos" w:eastAsia="Aptos"/>
+                <w:b/>
+                <w:i w:val="0"/>
+                <w:color w:val="1F4E78"/>
+                <w:sz w:val="18"/>
+              </w:rPr>
+              <w:t>10</w:t>
+            </w:r>
+          </w:p>
+        </w:tc>
+        <w:tc>
+          <w:tcPr>
+            <w:tcW w:type="dxa" w:w="8731"/>
+            <w:tcBorders>
+              <w:top w:val="single" w:sz="7" w:space="0" w:color="D9D9D9"/>
+              <w:left w:val="single" w:sz="7" w:space="0" w:color="D9D9D9"/>
+              <w:bottom w:val="single" w:sz="7" w:space="0" w:color="D9D9D9"/>
+              <w:right w:val="single" w:sz="7" w:space="0" w:color="D9D9D9"/>
+              <w:insideH w:val="single" w:sz="7" w:space="0" w:color="D9D9D9"/>
+              <w:insideV w:val="single" w:sz="7" w:space="0" w:color="D9D9D9"/>
+            </w:tcBorders>
+            <w:tcMar>
+              <w:top w:w="90" w:type="dxa"/>
+              <w:start w:w="110" w:type="dxa"/>
+              <w:bottom w:w="90" w:type="dxa"/>
+              <w:end w:w="110" w:type="dxa"/>
+            </w:tcMar>
+            <w:vAlign w:val="center"/>
+            <w:shd w:fill="F8FAFC"/>
+          </w:tcPr>
+          <w:p>
+            <w:pPr>
+              <w:keepNext w:val="0"/>
+              <w:spacing w:before="0" w:after="0" w:line="240" w:lineRule="auto"/>
+            </w:pPr>
+            <w:r>
+              <w:rPr>
+                <w:rFonts w:ascii="Aptos" w:hAnsi="Aptos" w:eastAsia="Aptos"/>
+                <w:b w:val="0"/>
+                <w:i w:val="0"/>
+                <w:color w:val="1F2937"/>
+                <w:sz w:val="18"/>
+              </w:rPr>
+              <w:t>piłkę, piłkę, piłką, kołdrą. Ę po pytaniu kogo? co? (biernik), Ą po pytaniu kim? czym? (narzędnik).</w:t>
+            </w:r>
+          </w:p>
+        </w:tc>
+      </w:tr>
+      <w:tr>
+        <w:tc>
+          <w:tcPr>
+            <w:tcW w:type="dxa" w:w="964"/>
+            <w:tcBorders>
+              <w:top w:val="single" w:sz="7" w:space="0" w:color="D9D9D9"/>
+              <w:left w:val="single" w:sz="7" w:space="0" w:color="D9D9D9"/>
+              <w:bottom w:val="single" w:sz="7" w:space="0" w:color="D9D9D9"/>
+              <w:right w:val="single" w:sz="7" w:space="0" w:color="D9D9D9"/>
+              <w:insideH w:val="single" w:sz="7" w:space="0" w:color="D9D9D9"/>
+              <w:insideV w:val="single" w:sz="7" w:space="0" w:color="D9D9D9"/>
+            </w:tcBorders>
+            <w:tcMar>
+              <w:top w:w="90" w:type="dxa"/>
+              <w:start w:w="110" w:type="dxa"/>
+              <w:bottom w:w="90" w:type="dxa"/>
+              <w:end w:w="110" w:type="dxa"/>
+            </w:tcMar>
+            <w:vAlign w:val="center"/>
+          </w:tcPr>
+          <w:p>
+            <w:pPr>
+              <w:keepNext w:val="0"/>
+              <w:spacing w:before="0" w:after="0" w:line="252" w:lineRule="auto"/>
+              <w:jc w:val="center"/>
+            </w:pPr>
+            <w:r>
+              <w:rPr>
+                <w:rFonts w:ascii="Aptos" w:hAnsi="Aptos" w:eastAsia="Aptos"/>
+                <w:b/>
+                <w:i w:val="0"/>
+                <w:color w:val="1F4E78"/>
+                <w:sz w:val="18"/>
+              </w:rPr>
+              <w:t>11</w:t>
+            </w:r>
+          </w:p>
+        </w:tc>
+        <w:tc>
+          <w:tcPr>
+            <w:tcW w:type="dxa" w:w="8731"/>
+            <w:tcBorders>
+              <w:top w:val="single" w:sz="7" w:space="0" w:color="D9D9D9"/>
+              <w:left w:val="single" w:sz="7" w:space="0" w:color="D9D9D9"/>
+              <w:bottom w:val="single" w:sz="7" w:space="0" w:color="D9D9D9"/>
+              <w:right w:val="single" w:sz="7" w:space="0" w:color="D9D9D9"/>
+              <w:insideH w:val="single" w:sz="7" w:space="0" w:color="D9D9D9"/>
+              <w:insideV w:val="single" w:sz="7" w:space="0" w:color="D9D9D9"/>
+            </w:tcBorders>
+            <w:tcMar>
+              <w:top w:w="90" w:type="dxa"/>
+              <w:start w:w="110" w:type="dxa"/>
+              <w:bottom w:w="90" w:type="dxa"/>
+              <w:end w:w="110" w:type="dxa"/>
+            </w:tcMar>
+            <w:vAlign w:val="center"/>
+          </w:tcPr>
+          <w:p>
+            <w:pPr>
+              <w:keepNext w:val="0"/>
+              <w:spacing w:before="0" w:after="0" w:line="240" w:lineRule="auto"/>
+            </w:pPr>
+            <w:r>
+              <w:rPr>
+                <w:rFonts w:ascii="Aptos" w:hAnsi="Aptos" w:eastAsia="Aptos"/>
+                <w:b w:val="0"/>
+                <w:i w:val="0"/>
+                <w:color w:val="1F2937"/>
+                <w:sz w:val="18"/>
+              </w:rPr>
+              <w:t>Zazdrość; np. zazdrosny, zazdrościć.</w:t>
+            </w:r>
+          </w:p>
+        </w:tc>
+      </w:tr>
+      <w:tr>
+        <w:tc>
+          <w:tcPr>
+            <w:tcW w:type="dxa" w:w="964"/>
+            <w:tcBorders>
+              <w:top w:val="single" w:sz="7" w:space="0" w:color="D9D9D9"/>
+              <w:left w:val="single" w:sz="7" w:space="0" w:color="D9D9D9"/>
+              <w:bottom w:val="single" w:sz="7" w:space="0" w:color="D9D9D9"/>
+              <w:right w:val="single" w:sz="7" w:space="0" w:color="D9D9D9"/>
+              <w:insideH w:val="single" w:sz="7" w:space="0" w:color="D9D9D9"/>
+              <w:insideV w:val="single" w:sz="7" w:space="0" w:color="D9D9D9"/>
+            </w:tcBorders>
+            <w:tcMar>
+              <w:top w:w="90" w:type="dxa"/>
+              <w:start w:w="110" w:type="dxa"/>
+              <w:bottom w:w="90" w:type="dxa"/>
+              <w:end w:w="110" w:type="dxa"/>
+            </w:tcMar>
+            <w:vAlign w:val="center"/>
+            <w:shd w:fill="F8FAFC"/>
+          </w:tcPr>
+          <w:p>
+            <w:pPr>
+              <w:keepNext w:val="0"/>
+              <w:spacing w:before="0" w:after="0" w:line="252" w:lineRule="auto"/>
+              <w:jc w:val="center"/>
+            </w:pPr>
+            <w:r>
+              <w:rPr>
+                <w:rFonts w:ascii="Aptos" w:hAnsi="Aptos" w:eastAsia="Aptos"/>
+                <w:b/>
+                <w:i w:val="0"/>
+                <w:color w:val="1F4E78"/>
+                <w:sz w:val="18"/>
+              </w:rPr>
+              <w:t>12</w:t>
+            </w:r>
+          </w:p>
+        </w:tc>
+        <w:tc>
+          <w:tcPr>
+            <w:tcW w:type="dxa" w:w="8731"/>
+            <w:tcBorders>
+              <w:top w:val="single" w:sz="7" w:space="0" w:color="D9D9D9"/>
+              <w:left w:val="single" w:sz="7" w:space="0" w:color="D9D9D9"/>
+              <w:bottom w:val="single" w:sz="7" w:space="0" w:color="D9D9D9"/>
+              <w:right w:val="single" w:sz="7" w:space="0" w:color="D9D9D9"/>
+              <w:insideH w:val="single" w:sz="7" w:space="0" w:color="D9D9D9"/>
+              <w:insideV w:val="single" w:sz="7" w:space="0" w:color="D9D9D9"/>
+            </w:tcBorders>
+            <w:tcMar>
+              <w:top w:w="90" w:type="dxa"/>
+              <w:start w:w="110" w:type="dxa"/>
+              <w:bottom w:w="90" w:type="dxa"/>
+              <w:end w:w="110" w:type="dxa"/>
+            </w:tcMar>
+            <w:vAlign w:val="center"/>
+            <w:shd w:fill="F8FAFC"/>
+          </w:tcPr>
+          <w:p>
+            <w:pPr>
+              <w:keepNext w:val="0"/>
+              <w:spacing w:before="0" w:after="0" w:line="240" w:lineRule="auto"/>
+            </w:pPr>
+            <w:r>
+              <w:rPr>
+                <w:rFonts w:ascii="Aptos" w:hAnsi="Aptos" w:eastAsia="Aptos"/>
+                <w:b w:val="0"/>
+                <w:i w:val="0"/>
+                <w:color w:val="1F2937"/>
+                <w:sz w:val="18"/>
+              </w:rPr>
+              <w:t>Narrator mówi w 1. osobie, nie zdradza się wprost, ale daje wskazówki, kim jest. 5-6 zdań, jedna sytuacja.</w:t>
+            </w:r>
+          </w:p>
+        </w:tc>
+      </w:tr>
+    </w:tbl>
+    <w:p>
+      <w:pPr>
+        <w:pStyle w:val="Heading2"/>
+      </w:pPr>
+      <w:r>
+        <w:rPr>
+          <w:rFonts w:ascii="Aptos" w:hAnsi="Aptos" w:eastAsia="Aptos"/>
+          <w:b/>
+          <w:i w:val="0"/>
+          <w:color w:val="000000"/>
+          <w:sz w:val="23"/>
+        </w:rPr>
+        <w:t>Szybkie omówienie po pracy</w:t>
+      </w:r>
+    </w:p>
+    <w:p>
+      <w:pPr>
+        <w:keepNext w:val="0"/>
+        <w:spacing w:before="0" w:after="0" w:line="252" w:lineRule="auto"/>
+      </w:pPr>
+      <w:r>
+        <w:rPr>
+          <w:rFonts w:ascii="Aptos" w:hAnsi="Aptos" w:eastAsia="Aptos"/>
+          <w:b w:val="0"/>
+          <w:i w:val="0"/>
+          <w:color w:val="1F2937"/>
+          <w:sz w:val="19"/>
+        </w:rPr>
+        <w:t>Poproś uczniów, aby wskazali fragment tekstu potwierdzający odpowiedź, poprawili jedno zadanie i nazwali strategię, która im pomogła.</w:t>
+      </w:r>
+    </w:p>
     <w:sectPr>
       <w:footerReference w:type="default" r:id="rId9"/>
       <w:pgSz w:w="11906" w:h="16838"/>

</xml_diff>

<commit_message>
Wyrownawcze: slajdy do odpowiedzi, punktacja na plusy, odhaczanie klas
- Projektor: przy wybranych zadaniach przycisk Slajd pokazuje odpowiedz na caly
  ekran (przyczyna-skutek, os czasow, fakt/opinia, P/F/?, czesci mowy, odmiana,
  ortografia, notatka punktowa...), strzalki przechodza miedzy slajdami
- Punktacja: 0-3 pkt bez plusa, 4-8 jeden plus, 9-10 dwa, 11-12 trzy
- Arkusz 3, zad. 12: notatka punktowa
- Klucz: poprawiona kolejnosc w ark. 1 (2, 3, 1, 4) i dowod w ark. 7
- Lista arkuszy: odhaczanie klas, z ktorymi arkusz jest zrobiony
  (tabela arkusze_postep, do czasu migracji zapis w przegladarce)

Co-Authored-By: Claude Opus 5.5 <noreply@anthropic.com>
</commit_message>
<xml_diff>
--- a/public/materialy/wyrownawcze/klucz-odpowiedzi-arkusze-wyrownawcze.docx
+++ b/public/materialy/wyrownawcze/klucz-odpowiedzi-arkusze-wyrownawcze.docx
@@ -360,7 +360,7 @@
                 <w:color w:val="1F2937"/>
                 <w:sz w:val="18"/>
               </w:rPr>
-              <w:t>3, 2, 1, 4 - w kolejności pozycji zapisanych w zadaniu.</w:t>
+              <w:t>2, 3, 1, 4 - w kolejności pozycji zapisanych w zadaniu.</w:t>
             </w:r>
           </w:p>
         </w:tc>
@@ -3153,7 +3153,7 @@
                 <w:color w:val="1F2937"/>
                 <w:sz w:val="18"/>
               </w:rPr>
-              <w:t>Notatka ma tytuł, trzy czynności i zachowuje logiczną kolejność.</w:t>
+              <w:t>Notatka ma tytuł i trzy ponumerowane punkty w sensownej kolejności. Każdy punkt to krótkie hasło, np. 1. Odkładam telefon. 2. Pakuję plecak na jutro. 3. Wietrzę pokój i kładę się o stałej porze.</w:t>
             </w:r>
           </w:p>
         </w:tc>
@@ -6532,7 +6532,7 @@
                 <w:color w:val="1F2937"/>
                 <w:sz w:val="18"/>
               </w:rPr>
-              <w:t>Pies. Dowody, np.: trzyma piłkę w zębach, chodzi na spacery, obwąchuje krzaki, ma miskę, pan złapał go za ucho, je skarpetkę.</w:t>
+              <w:t>Pies. Dowody, np.: trzyma piłkę w zębach, chodzi na spacery, obwąchuje krzaki, ma miskę, Nowy złapał go za ucho, je skarpetkę.</w:t>
             </w:r>
           </w:p>
         </w:tc>

</xml_diff>